<commit_message>
docs: update document for asm 1
</commit_message>
<xml_diff>
--- a/docs/master_document.docx
+++ b/docs/master_document.docx
@@ -1,6 +1,6 @@
 
 <file path=word/document.xml><?xml version="1.0" encoding="utf-8"?>
-<w:document xmlns:wpc="http://schemas.microsoft.com/office/word/2010/wordprocessingCanvas" xmlns:cx="http://schemas.microsoft.com/office/drawing/2014/chartex" xmlns:cx1="http://schemas.microsoft.com/office/drawing/2015/9/8/chartex" xmlns:cx2="http://schemas.microsoft.com/office/drawing/2015/10/21/chartex" xmlns:cx3="http://schemas.microsoft.com/office/drawing/2016/5/9/chartex" xmlns:cx4="http://schemas.microsoft.com/office/drawing/2016/5/10/chartex" xmlns:cx5="http://schemas.microsoft.com/office/drawing/2016/5/11/chartex" xmlns:cx6="http://schemas.microsoft.com/office/drawing/2016/5/12/chartex" xmlns:cx7="http://schemas.microsoft.com/office/drawing/2016/5/13/chartex" xmlns:cx8="http://schemas.microsoft.com/office/drawing/2016/5/14/chartex" xmlns:mc="http://schemas.openxmlformats.org/markup-compatibility/2006" xmlns:m="http://schemas.openxmlformats.org/officeDocument/2006/math" xmlns:aink="http://schemas.microsoft.com/office/drawing/2016/ink" xmlns:am3d="http://schemas.microsoft.com/office/drawing/2017/model3d" xmlns:oel="http://schemas.microsoft.com/office/2019/extlst" xmlns:r="http://schemas.openxmlformats.org/officeDocument/2006/relationships" xmlns:wp14="http://schemas.microsoft.com/office/word/2010/wordprocessingDrawing" xmlns:wp="http://schemas.openxmlformats.org/drawingml/2006/wordprocessingDrawing" xmlns:wpg="http://schemas.microsoft.com/office/word/2010/wordprocessingGroup" xmlns:wpi="http://schemas.microsoft.com/office/word/2010/wordprocessingInk" xmlns:wps="http://schemas.microsoft.com/office/word/2010/wordprocessingShape" xmlns:o="urn:schemas-microsoft-com:office:office" xmlns:v="urn:schemas-microsoft-com:vml" xmlns:w10="urn:schemas-microsoft-com:office:word" xmlns:w="http://schemas.openxmlformats.org/wordprocessingml/2006/main" xmlns:w14="http://schemas.microsoft.com/office/word/2010/wordml" xmlns:w15="http://schemas.microsoft.com/office/word/2012/wordml" xmlns:w16cei="http://schemas.microsoft.com/office/word/2026/wordml/cei" xmlns:w16cex="http://schemas.microsoft.com/office/word/2018/wordml/cex" xmlns:w16cid="http://schemas.microsoft.com/office/word/2016/wordml/cid" xmlns:w16="http://schemas.microsoft.com/office/word/2018/wordml" xmlns:w16sdtdh="http://schemas.microsoft.com/office/word/2020/wordml/sdtdatahash" xmlns:w16sdtfl="http://schemas.microsoft.com/office/word/2024/wordml/sdtformatlock" xmlns:w16se="http://schemas.microsoft.com/office/word/2015/wordml/symex" xmlns:w16du="http://schemas.microsoft.com/office/word/2023/wordml/word16du" xmlns:wne="http://schemas.microsoft.com/office/word/2006/wordml" mc:Ignorable="w14 w15 w16se w16cid w16 w16cex w16sdtdh w16sdtfl w16du wp14">
+<w:document xmlns:wpc="http://schemas.microsoft.com/office/word/2010/wordprocessingCanvas" xmlns:cx="http://schemas.microsoft.com/office/drawing/2014/chartex" xmlns:cx1="http://schemas.microsoft.com/office/drawing/2015/9/8/chartex" xmlns:cx2="http://schemas.microsoft.com/office/drawing/2015/10/21/chartex" xmlns:cx3="http://schemas.microsoft.com/office/drawing/2016/5/9/chartex" xmlns:cx4="http://schemas.microsoft.com/office/drawing/2016/5/10/chartex" xmlns:cx5="http://schemas.microsoft.com/office/drawing/2016/5/11/chartex" xmlns:cx6="http://schemas.microsoft.com/office/drawing/2016/5/12/chartex" xmlns:cx7="http://schemas.microsoft.com/office/drawing/2016/5/13/chartex" xmlns:cx8="http://schemas.microsoft.com/office/drawing/2016/5/14/chartex" xmlns:mc="http://schemas.openxmlformats.org/markup-compatibility/2006" xmlns:aink="http://schemas.microsoft.com/office/drawing/2016/ink" xmlns:am3d="http://schemas.microsoft.com/office/drawing/2017/model3d" xmlns:o="urn:schemas-microsoft-com:office:office" xmlns:oel="http://schemas.microsoft.com/office/2019/extlst" xmlns:r="http://schemas.openxmlformats.org/officeDocument/2006/relationships" xmlns:m="http://schemas.openxmlformats.org/officeDocument/2006/math" xmlns:v="urn:schemas-microsoft-com:vml" xmlns:wp14="http://schemas.microsoft.com/office/word/2010/wordprocessingDrawing" xmlns:wp="http://schemas.openxmlformats.org/drawingml/2006/wordprocessingDrawing" xmlns:w10="urn:schemas-microsoft-com:office:word" xmlns:w="http://schemas.openxmlformats.org/wordprocessingml/2006/main" xmlns:w14="http://schemas.microsoft.com/office/word/2010/wordml" xmlns:w15="http://schemas.microsoft.com/office/word/2012/wordml" xmlns:w16cei="http://schemas.microsoft.com/office/word/2026/wordml/cei" xmlns:w16cex="http://schemas.microsoft.com/office/word/2018/wordml/cex" xmlns:w16cid="http://schemas.microsoft.com/office/word/2016/wordml/cid" xmlns:w16="http://schemas.microsoft.com/office/word/2018/wordml" xmlns:w16du="http://schemas.microsoft.com/office/word/2023/wordml/word16du" xmlns:w16sdtdh="http://schemas.microsoft.com/office/word/2020/wordml/sdtdatahash" xmlns:w16sdtfl="http://schemas.microsoft.com/office/word/2024/wordml/sdtformatlock" xmlns:w16se="http://schemas.microsoft.com/office/word/2015/wordml/symex" xmlns:wpg="http://schemas.microsoft.com/office/word/2010/wordprocessingGroup" xmlns:wpi="http://schemas.microsoft.com/office/word/2010/wordprocessingInk" xmlns:wne="http://schemas.microsoft.com/office/word/2006/wordml" xmlns:wps="http://schemas.microsoft.com/office/word/2010/wordprocessingShape" mc:Ignorable="w14 w15 w16se w16cid w16 w16cex w16sdtdh w16sdtfl w16du wp14">
   <w:body>
     <w:p>
       <w:pPr>
@@ -164,25 +164,7 @@
               <w:rPr>
                 <w:color w:val="1E2761"/>
               </w:rPr>
-              <w:t>Friday</w:t>
-            </w:r>
-            <w:r>
-              <w:rPr>
-                <w:color w:val="1E2761"/>
-              </w:rPr>
-              <w:t xml:space="preserve">, </w:t>
-            </w:r>
-            <w:r>
-              <w:rPr>
-                <w:color w:val="1E2761"/>
-              </w:rPr>
-              <w:t>7</w:t>
-            </w:r>
-            <w:r>
-              <w:rPr>
-                <w:color w:val="1E2761"/>
-              </w:rPr>
-              <w:t xml:space="preserve"> August 2026</w:t>
+              <w:t>Friday, 7 August 2026</w:t>
             </w:r>
           </w:p>
         </w:tc>
@@ -225,6 +207,10 @@
     <w:p>
       <w:pPr>
         <w:spacing w:after="60"/>
+        <w:rPr>
+          <w:b/>
+          <w:bCs/>
+        </w:rPr>
       </w:pPr>
       <w:r>
         <w:rPr>
@@ -233,87 +219,97 @@
         </w:rPr>
         <w:t xml:space="preserve">Deliverable: </w:t>
       </w:r>
-      <w:r>
-        <w:t>Requirements document, committed to the team repo.</w:t>
-      </w:r>
-    </w:p>
-    <w:p>
-      <w:pPr>
-        <w:spacing w:after="140"/>
-      </w:pPr>
-      <w:r>
-        <w:rPr>
-          <w:b/>
-          <w:bCs/>
-        </w:rPr>
-        <w:t xml:space="preserve">Note for next role: </w:t>
-      </w:r>
-      <w:r>
-        <w:t xml:space="preserve">For the UX, the team branding colour palette and typography are not yet defined - UX needs to </w:t>
-      </w:r>
-      <w:proofErr w:type="gramStart"/>
-      <w:r>
-        <w:t>confirms</w:t>
-      </w:r>
-      <w:proofErr w:type="gramEnd"/>
-      <w:r>
-        <w:t xml:space="preserve"> there before Dev starts styling.</w:t>
-      </w:r>
-    </w:p>
-    <w:p>
-      <w:pPr>
-        <w:shd w:val="clear" w:color="auto" w:fill="16204F"/>
-        <w:spacing w:after="120"/>
-        <w:ind w:left="100" w:right="100"/>
-        <w:rPr>
-          <w:b/>
-          <w:bCs/>
-          <w:color w:val="FFFFFF"/>
-          <w:lang w:val="en-US"/>
-        </w:rPr>
-      </w:pPr>
-      <w:r>
-        <w:rPr>
-          <w:b/>
-          <w:bCs/>
-          <w:color w:val="FFFFFF"/>
-        </w:rPr>
-        <w:t xml:space="preserve">Git URL:  </w:t>
-      </w:r>
-      <w:hyperlink r:id="rId7" w:history="1">
+    </w:p>
+    <w:p>
+      <w:pPr>
+        <w:pStyle w:val="ListParagraph"/>
+        <w:numPr>
+          <w:ilvl w:val="0"/>
+          <w:numId w:val="6"/>
+        </w:numPr>
+        <w:spacing w:after="60"/>
+        <w:rPr>
+          <w:lang w:val="en-ID"/>
+        </w:rPr>
+      </w:pPr>
+      <w:r>
+        <w:t>Requirements document</w:t>
+      </w:r>
+      <w:r>
+        <w:t xml:space="preserve">: </w:t>
+      </w:r>
+      <w:hyperlink r:id="rId10" w:history="1">
         <w:r>
           <w:rPr>
             <w:rStyle w:val="Hyperlink"/>
-            <w:b/>
-            <w:bCs/>
-            <w:lang w:val="en-US"/>
+            <w:lang w:val="en-ID"/>
           </w:rPr>
-          <w:t>https://github.com/emeralddd/capstone</w:t>
+          <w:t>login_restyling.docx</w:t>
         </w:r>
+      </w:hyperlink>
+    </w:p>
+    <w:p>
+      <w:pPr>
+        <w:pStyle w:val="ListParagraph"/>
+        <w:numPr>
+          <w:ilvl w:val="0"/>
+          <w:numId w:val="6"/>
+        </w:numPr>
+        <w:spacing w:after="60"/>
+      </w:pPr>
+      <w:r>
+        <w:t>C</w:t>
+      </w:r>
+      <w:r>
+        <w:t>ommitted to the team repo</w:t>
+      </w:r>
+      <w:r>
+        <w:t xml:space="preserve">: </w:t>
+      </w:r>
+      <w:hyperlink r:id="rId11" w:history="1">
         <w:r>
           <w:rPr>
             <w:rStyle w:val="Hyperlink"/>
-            <w:b/>
-            <w:bCs/>
-            <w:lang w:val="en-US"/>
           </w:rPr>
-          <w:t>-</w:t>
-        </w:r>
-        <w:r>
-          <w:rPr>
-            <w:rStyle w:val="Hyperlink"/>
-            <w:b/>
-            <w:bCs/>
-            <w:lang w:val="en-US"/>
-          </w:rPr>
-          <w:t>boilerplate/blob/main/docs/login_restyling.docx</w:t>
+          <w:t>https://github.com/emeralddd/capstone-boilerplate/blob/main/docs/login_restyling.docx</w:t>
         </w:r>
       </w:hyperlink>
-    </w:p>
-    <w:p>
-      <w:pPr>
-        <w:spacing w:after="260"/>
-      </w:pPr>
+      <w:r>
+        <w:t xml:space="preserve"> </w:t>
+      </w:r>
+    </w:p>
+    <w:p>
+      <w:pPr>
+        <w:spacing w:after="140"/>
+        <w:rPr>
+          <w:lang w:val="en-US"/>
+        </w:rPr>
+      </w:pPr>
+      <w:r>
+        <w:rPr>
+          <w:b/>
+          <w:bCs/>
+        </w:rPr>
+        <w:t>N</w:t>
+      </w:r>
+      <w:r>
+        <w:rPr>
+          <w:b/>
+          <w:bCs/>
+        </w:rPr>
+        <w:t xml:space="preserve">ote for next role: </w:t>
+      </w:r>
+      <w:r>
+        <w:t xml:space="preserve">For the UX, the team branding colour palette and typography are not yet defined - UX needs to </w:t>
+      </w:r>
+      <w:proofErr w:type="gramStart"/>
+      <w:r>
+        <w:t>confirms</w:t>
+      </w:r>
+      <w:proofErr w:type="gramEnd"/>
+      <w:r>
+        <w:t xml:space="preserve"> there before Dev starts styling.</w:t>
+      </w:r>
     </w:p>
     <w:p>
       <w:pPr>
@@ -374,7 +370,7 @@
         <w:tc>
           <w:tcPr>
             <w:tcW w:w="3600" w:type="dxa"/>
-            <w:shd w:val="clear" w:color="auto" w:fill="F9E2AF"/>
+            <w:shd w:val="clear" w:color="auto" w:fill="F6C5AC" w:themeFill="accent2" w:themeFillTint="66"/>
             <w:tcMar>
               <w:top w:w="80" w:type="dxa"/>
               <w:left w:w="120" w:type="dxa"/>
@@ -384,11 +380,23 @@
             <w:vAlign w:val="center"/>
           </w:tcPr>
           <w:p>
+            <w:pPr>
+              <w:rPr>
+                <w:color w:val="1E2761"/>
+                <w:highlight w:val="green"/>
+              </w:rPr>
+            </w:pPr>
             <w:r>
               <w:rPr>
                 <w:color w:val="1E2761"/>
               </w:rPr>
               <w:t xml:space="preserve">UX — </w:t>
+            </w:r>
+            <w:r>
+              <w:rPr>
+                <w:color w:val="1E2761"/>
+              </w:rPr>
+              <w:t>Marcell Joe Sugianto</w:t>
             </w:r>
           </w:p>
         </w:tc>
@@ -418,7 +426,7 @@
         <w:tc>
           <w:tcPr>
             <w:tcW w:w="2000" w:type="dxa"/>
-            <w:shd w:val="clear" w:color="auto" w:fill="FFFFFF"/>
+            <w:shd w:val="clear" w:color="auto" w:fill="FFFFFF" w:themeFill="background1"/>
             <w:tcMar>
               <w:top w:w="80" w:type="dxa"/>
               <w:left w:w="120" w:type="dxa"/>
@@ -452,126 +460,202 @@
       </w:r>
     </w:p>
     <w:p>
-      <w:pPr>
-        <w:spacing w:after="60"/>
-      </w:pPr>
-      <w:r>
-        <w:rPr>
-          <w:b/>
-          <w:bCs/>
-        </w:rPr>
-        <w:t xml:space="preserve">Done: </w:t>
-      </w:r>
-      <w:r>
-        <w:t xml:space="preserve">Produced </w:t>
-      </w:r>
-      <w:proofErr w:type="spellStart"/>
-      <w:r>
-        <w:t>mockups</w:t>
-      </w:r>
-      <w:proofErr w:type="spellEnd"/>
-      <w:r>
-        <w:t xml:space="preserve"> for the restyled login page and the team page layout, including the placeholder-avatar and long-blurb cases BA flagged.</w:t>
-      </w:r>
-    </w:p>
-    <w:p>
-      <w:pPr>
-        <w:spacing w:after="60"/>
-      </w:pPr>
-      <w:r>
-        <w:rPr>
-          <w:b/>
-          <w:bCs/>
-        </w:rPr>
-        <w:t xml:space="preserve">Deliverable: </w:t>
-      </w:r>
-      <w:r>
-        <w:t>Figma file, linked from the team repo.</w:t>
-      </w:r>
-    </w:p>
-    <w:p>
-      <w:pPr>
-        <w:spacing w:after="140"/>
-      </w:pPr>
-      <w:r>
-        <w:rPr>
-          <w:b/>
-          <w:bCs/>
-        </w:rPr>
-        <w:t xml:space="preserve">Note for next role: </w:t>
-      </w:r>
-      <w:r>
-        <w:t>BA — the long-blurb case is handled with a "read more" expand rather than truncation. Please confirm that's acceptable before you approve.</w:t>
-      </w:r>
-    </w:p>
-    <w:p>
-      <w:pPr>
-        <w:spacing w:after="140"/>
-      </w:pPr>
-    </w:p>
-    <w:p>
-      <w:pPr>
-        <w:spacing w:after="140"/>
-      </w:pPr>
-      <w:r>
-        <w:rPr>
-          <w:noProof/>
-        </w:rPr>
+      <w:r>
+        <w:rPr>
+          <w:b/>
+          <w:bCs/>
+          <w:color w:val="000000" w:themeColor="text1"/>
+        </w:rPr>
+        <w:t>Done</w:t>
+      </w:r>
+    </w:p>
+    <w:p>
+      <w:r>
+        <w:rPr>
+          <w:color w:val="000000" w:themeColor="text1"/>
+        </w:rPr>
+        <w:t xml:space="preserve">I made a mockup design of the Teams and Login page as per </w:t>
+      </w:r>
+      <w:proofErr w:type="gramStart"/>
+      <w:r>
+        <w:rPr>
+          <w:color w:val="000000" w:themeColor="text1"/>
+        </w:rPr>
+        <w:t>sepcification, and</w:t>
+      </w:r>
+      <w:proofErr w:type="gramEnd"/>
+      <w:r>
+        <w:rPr>
+          <w:color w:val="000000" w:themeColor="text1"/>
+        </w:rPr>
+        <w:t xml:space="preserve"> have created some assets used in the designs.</w:t>
+      </w:r>
+    </w:p>
+    <w:p/>
+    <w:p>
+      <w:r>
+        <w:rPr>
+          <w:b/>
+          <w:bCs/>
+          <w:color w:val="000000" w:themeColor="text1"/>
+        </w:rPr>
+        <w:t>Deliverables</w:t>
+      </w:r>
+    </w:p>
+    <w:p>
+      <w:pPr>
+        <w:pStyle w:val="ListParagraph"/>
+        <w:numPr>
+          <w:ilvl w:val="0"/>
+          <w:numId w:val="3"/>
+        </w:numPr>
+        <w:rPr>
+          <w:rFonts w:ascii="Noto Sans" w:eastAsia="Noto Sans" w:hAnsi="Noto Sans" w:cs="Noto Sans"/>
+          <w:sz w:val="24"/>
+          <w:szCs w:val="24"/>
+        </w:rPr>
+      </w:pPr>
+      <w:r>
+        <w:t xml:space="preserve">Design: </w:t>
+      </w:r>
+      <w:hyperlink r:id="rId12">
+        <w:r>
+          <w:rPr>
+            <w:rStyle w:val="Hyperlink"/>
+            <w:rFonts w:ascii="Noto Sans" w:eastAsia="Noto Sans" w:hAnsi="Noto Sans" w:cs="Noto Sans"/>
+            <w:sz w:val="24"/>
+            <w:szCs w:val="24"/>
+          </w:rPr>
+          <w:t>https://www.figma.com/design/JnkORkFEkRuspZS0keT8zl/Capstone?node-id=0-1&amp;t=XG9H1VO4tKxsCIFS-1</w:t>
+        </w:r>
+      </w:hyperlink>
+    </w:p>
+    <w:p>
+      <w:pPr>
+        <w:pStyle w:val="ListParagraph"/>
+        <w:numPr>
+          <w:ilvl w:val="0"/>
+          <w:numId w:val="3"/>
+        </w:numPr>
+        <w:rPr>
+          <w:rFonts w:ascii="Noto Sans" w:eastAsia="Noto Sans" w:hAnsi="Noto Sans" w:cs="Noto Sans"/>
+          <w:sz w:val="24"/>
+          <w:szCs w:val="24"/>
+        </w:rPr>
+      </w:pPr>
+      <w:r>
+        <w:t xml:space="preserve">Assets: </w:t>
+      </w:r>
+      <w:hyperlink r:id="rId13">
+        <w:r>
+          <w:rPr>
+            <w:rStyle w:val="Hyperlink"/>
+            <w:rFonts w:ascii="Noto Sans" w:eastAsia="Noto Sans" w:hAnsi="Noto Sans" w:cs="Noto Sans"/>
+            <w:sz w:val="24"/>
+            <w:szCs w:val="24"/>
+          </w:rPr>
+          <w:t>https://www.figma.com/design/JnkORkFEkRuspZS0keT8zl/Capstone?node-id=0-1&amp;t=XG9H1VO4tKxsCIFS-1</w:t>
+        </w:r>
+      </w:hyperlink>
+    </w:p>
+    <w:p>
+      <w:r>
+        <w:rPr>
+          <w:b/>
+          <w:bCs/>
+        </w:rPr>
+        <w:t>Note to next role</w:t>
+      </w:r>
+    </w:p>
+    <w:p>
+      <w:pPr>
+        <w:pStyle w:val="ListParagraph"/>
+        <w:numPr>
+          <w:ilvl w:val="0"/>
+          <w:numId w:val="2"/>
+        </w:numPr>
+      </w:pPr>
+      <w:r>
+        <w:t>The color palette used for the designs is in the "Palette" page of the FigmaDesign file.</w:t>
+      </w:r>
+    </w:p>
+    <w:p>
+      <w:pPr>
+        <w:pStyle w:val="ListParagraph"/>
+        <w:numPr>
+          <w:ilvl w:val="0"/>
+          <w:numId w:val="2"/>
+        </w:numPr>
+      </w:pPr>
+      <w:r>
+        <w:t>I've also pushed the assets and the design link on GitHub</w:t>
+      </w:r>
+    </w:p>
+    <w:p>
+      <w:pPr>
+        <w:pStyle w:val="ListParagraph"/>
+        <w:numPr>
+          <w:ilvl w:val="1"/>
+          <w:numId w:val="2"/>
+        </w:numPr>
+      </w:pPr>
+      <w:r>
+        <w:t>Asset</w:t>
+      </w:r>
+      <w:proofErr w:type="gramStart"/>
+      <w:r>
+        <w:t>: .</w:t>
+      </w:r>
+      <w:proofErr w:type="gramEnd"/>
+      <w:r>
+        <w:t>/frontend/assets/</w:t>
+      </w:r>
+    </w:p>
+    <w:p>
+      <w:pPr>
+        <w:pStyle w:val="ListParagraph"/>
+        <w:numPr>
+          <w:ilvl w:val="1"/>
+          <w:numId w:val="2"/>
+        </w:numPr>
+      </w:pPr>
+      <w:r>
         <w:lastRenderedPageBreak/>
-        <w:drawing>
-          <wp:inline distT="0" distB="0" distL="0" distR="0" wp14:anchorId="684C28BF" wp14:editId="6A30DE2E">
-            <wp:extent cx="3503930" cy="2589530"/>
-            <wp:effectExtent l="0" t="0" r="1270" b="1270"/>
-            <wp:docPr id="55452720" name="Picture 1"/>
-            <wp:cNvGraphicFramePr>
-              <a:graphicFrameLocks xmlns:a="http://schemas.openxmlformats.org/drawingml/2006/main" noChangeAspect="1"/>
-            </wp:cNvGraphicFramePr>
-            <a:graphic xmlns:a="http://schemas.openxmlformats.org/drawingml/2006/main">
-              <a:graphicData uri="http://schemas.openxmlformats.org/drawingml/2006/picture">
-                <pic:pic xmlns:pic="http://schemas.openxmlformats.org/drawingml/2006/picture">
-                  <pic:nvPicPr>
-                    <pic:cNvPr id="0" name="Picture 1"/>
-                    <pic:cNvPicPr>
-                      <a:picLocks noChangeAspect="1" noChangeArrowheads="1"/>
-                    </pic:cNvPicPr>
-                  </pic:nvPicPr>
-                  <pic:blipFill>
-                    <a:blip r:embed="rId8">
-                      <a:extLst>
-                        <a:ext uri="{28A0092B-C50C-407E-A947-70E740481C1C}">
-                          <a14:useLocalDpi xmlns:a14="http://schemas.microsoft.com/office/drawing/2010/main" val="0"/>
-                        </a:ext>
-                      </a:extLst>
-                    </a:blip>
-                    <a:srcRect/>
-                    <a:stretch>
-                      <a:fillRect/>
-                    </a:stretch>
-                  </pic:blipFill>
-                  <pic:spPr bwMode="auto">
-                    <a:xfrm>
-                      <a:off x="0" y="0"/>
-                      <a:ext cx="3503930" cy="2589530"/>
-                    </a:xfrm>
-                    <a:prstGeom prst="rect">
-                      <a:avLst/>
-                    </a:prstGeom>
-                    <a:noFill/>
-                    <a:ln>
-                      <a:noFill/>
-                    </a:ln>
-                  </pic:spPr>
-                </pic:pic>
-              </a:graphicData>
-            </a:graphic>
-          </wp:inline>
-        </w:drawing>
-      </w:r>
-    </w:p>
-    <w:p>
-      <w:pPr>
-        <w:spacing w:after="260"/>
-      </w:pPr>
+        <w:t>Design link</w:t>
+      </w:r>
+      <w:proofErr w:type="gramStart"/>
+      <w:r>
+        <w:t>: .</w:t>
+      </w:r>
+      <w:proofErr w:type="gramEnd"/>
+      <w:r>
+        <w:t>/docs/FigmaDesign_Link.md</w:t>
+      </w:r>
+    </w:p>
+    <w:p>
+      <w:pPr>
+        <w:shd w:val="clear" w:color="auto" w:fill="16204F"/>
+        <w:spacing w:after="120"/>
+        <w:ind w:left="100" w:right="100"/>
+      </w:pPr>
+      <w:r>
+        <w:rPr>
+          <w:b/>
+          <w:bCs/>
+          <w:color w:val="FFFFFF" w:themeColor="background1"/>
+        </w:rPr>
+        <w:t xml:space="preserve">Git URL:  </w:t>
+      </w:r>
+      <w:hyperlink r:id="rId14">
+        <w:r>
+          <w:rPr>
+            <w:rStyle w:val="Hyperlink"/>
+            <w:b/>
+            <w:bCs/>
+          </w:rPr>
+          <w:t>https://github.com/emeralddd/capstone-boilerplate/blob/main/docs/FigmaDesign_Link.md</w:t>
+        </w:r>
+      </w:hyperlink>
     </w:p>
     <w:p>
       <w:pPr>
@@ -648,6 +732,12 @@
               </w:rPr>
               <w:t xml:space="preserve">BA — </w:t>
             </w:r>
+            <w:r>
+              <w:rPr>
+                <w:color w:val="1E2761"/>
+              </w:rPr>
+              <w:t>Hiep Vu</w:t>
+            </w:r>
           </w:p>
         </w:tc>
         <w:tc>
@@ -676,7 +766,7 @@
         <w:tc>
           <w:tcPr>
             <w:tcW w:w="2000" w:type="dxa"/>
-            <w:shd w:val="clear" w:color="auto" w:fill="FFFFFF"/>
+            <w:shd w:val="clear" w:color="auto" w:fill="FFFFFF" w:themeFill="background1"/>
             <w:tcMar>
               <w:top w:w="80" w:type="dxa"/>
               <w:left w:w="120" w:type="dxa"/>
@@ -761,33 +851,6 @@
       <w:r>
         <w:t>Dev — you're clear to build exactly to the Figma file, no open questions from BA's side.</w:t>
       </w:r>
-    </w:p>
-    <w:p>
-      <w:pPr>
-        <w:shd w:val="clear" w:color="auto" w:fill="16204F"/>
-        <w:spacing w:after="120"/>
-        <w:ind w:left="100" w:right="100"/>
-      </w:pPr>
-      <w:r>
-        <w:rPr>
-          <w:b/>
-          <w:bCs/>
-          <w:color w:val="FFFFFF"/>
-        </w:rPr>
-        <w:t xml:space="preserve">Git URL:  </w:t>
-      </w:r>
-      <w:r>
-        <w:rPr>
-          <w:rFonts w:ascii="Consolas" w:eastAsia="Consolas" w:hAnsi="Consolas" w:cs="Consolas"/>
-          <w:color w:val="8FD3D6"/>
-        </w:rPr>
-        <w:t>https://github.com/team-byte-size/team-page/blob/main/docs/design-validation.md</w:t>
-      </w:r>
-    </w:p>
-    <w:p>
-      <w:pPr>
-        <w:spacing w:after="260"/>
-      </w:pPr>
     </w:p>
     <w:p>
       <w:pPr>
@@ -864,6 +927,12 @@
               </w:rPr>
               <w:t xml:space="preserve">Dev 1 — </w:t>
             </w:r>
+            <w:r>
+              <w:rPr>
+                <w:color w:val="1E2761"/>
+              </w:rPr>
+              <w:t>Rhys Carroll</w:t>
+            </w:r>
           </w:p>
         </w:tc>
         <w:tc>
@@ -892,7 +961,7 @@
         <w:tc>
           <w:tcPr>
             <w:tcW w:w="2000" w:type="dxa"/>
-            <w:shd w:val="clear" w:color="auto" w:fill="FFFFFF"/>
+            <w:shd w:val="clear" w:color="auto" w:fill="FFFFFF" w:themeFill="background1"/>
             <w:tcMar>
               <w:top w:w="80" w:type="dxa"/>
               <w:left w:w="120" w:type="dxa"/>
@@ -902,11 +971,28 @@
             <w:vAlign w:val="center"/>
           </w:tcPr>
           <w:p>
-            <w:r>
-              <w:rPr>
-                <w:color w:val="1E2761"/>
-              </w:rPr>
-              <w:t>Wednesday, 5 August 2026</w:t>
+            <w:pPr>
+              <w:rPr>
+                <w:color w:val="1E2761"/>
+              </w:rPr>
+            </w:pPr>
+            <w:r>
+              <w:rPr>
+                <w:color w:val="1E2761"/>
+              </w:rPr>
+              <w:t xml:space="preserve">Wednesday, </w:t>
+            </w:r>
+            <w:r>
+              <w:rPr>
+                <w:color w:val="1E2761"/>
+              </w:rPr>
+              <w:t>12</w:t>
+            </w:r>
+            <w:r>
+              <w:rPr>
+                <w:color w:val="1E2761"/>
+              </w:rPr>
+              <w:t xml:space="preserve"> August 2026</w:t>
             </w:r>
           </w:p>
         </w:tc>
@@ -924,6 +1010,14 @@
         </w:rPr>
         <w:t>Completion comment</w:t>
       </w:r>
+      <w:r>
+        <w:rPr>
+          <w:b/>
+          <w:bCs/>
+          <w:color w:val="1E2761"/>
+        </w:rPr>
+        <w:t>s</w:t>
+      </w:r>
     </w:p>
     <w:p>
       <w:pPr>
@@ -937,15 +1031,10 @@
         <w:t xml:space="preserve">Done: </w:t>
       </w:r>
       <w:r>
-        <w:t>Applied the approved login styling (</w:t>
-      </w:r>
-      <w:proofErr w:type="spellStart"/>
-      <w:r>
-        <w:t>colors</w:t>
-      </w:r>
-      <w:proofErr w:type="spellEnd"/>
-      <w:r>
-        <w:t>, layout, branding). Confirmed auth logic, validation, and session handling are all untouched.</w:t>
+        <w:t>Applied the approved login styling (colors, layout, branding). Confirmed auth logic, validation, and session handling are all untouched.</w:t>
+      </w:r>
+      <w:r>
+        <w:t xml:space="preserve"> Styling scales to different screen sizes too.</w:t>
       </w:r>
     </w:p>
     <w:p>
@@ -966,6 +1055,10 @@
     <w:p>
       <w:pPr>
         <w:spacing w:after="140"/>
+        <w:rPr>
+          <w:b/>
+          <w:bCs/>
+        </w:rPr>
       </w:pPr>
       <w:r>
         <w:rPr>
@@ -975,7 +1068,76 @@
         <w:t xml:space="preserve">Note for next role: </w:t>
       </w:r>
       <w:r>
-        <w:t>Nothing blocking — moving straight on to the team page build myself.</w:t>
+        <w:rPr>
+          <w:b/>
+          <w:bCs/>
+        </w:rPr>
+        <w:t>Preexisting</w:t>
+      </w:r>
+      <w:r>
+        <w:rPr>
+          <w:b/>
+          <w:bCs/>
+        </w:rPr>
+        <w:t xml:space="preserve"> assets inside of frontend/components/layout/auth </w:t>
+      </w:r>
+      <w:r>
+        <w:rPr>
+          <w:b/>
+          <w:bCs/>
+        </w:rPr>
+        <w:t>can be reused</w:t>
+      </w:r>
+      <w:r>
+        <w:rPr>
+          <w:b/>
+          <w:bCs/>
+        </w:rPr>
+        <w:t xml:space="preserve"> for </w:t>
+      </w:r>
+      <w:proofErr w:type="gramStart"/>
+      <w:r>
+        <w:rPr>
+          <w:b/>
+          <w:bCs/>
+        </w:rPr>
+        <w:t>teams</w:t>
+      </w:r>
+      <w:proofErr w:type="gramEnd"/>
+      <w:r>
+        <w:rPr>
+          <w:b/>
+          <w:bCs/>
+        </w:rPr>
+        <w:t xml:space="preserve"> page, team page member card had incomplete draft component created, current dashboard should be reworked into </w:t>
+      </w:r>
+      <w:r>
+        <w:rPr>
+          <w:b/>
+          <w:bCs/>
+        </w:rPr>
+        <w:t>team's</w:t>
+      </w:r>
+      <w:r>
+        <w:rPr>
+          <w:b/>
+          <w:bCs/>
+        </w:rPr>
+        <w:t xml:space="preserve"> page and nor</w:t>
+      </w:r>
+      <w:r>
+        <w:rPr>
+          <w:b/>
+          <w:bCs/>
+        </w:rPr>
+        <w:t>mal dashboard changed ba</w:t>
+      </w:r>
+      <w:r>
+        <w:rPr>
+          <w:b/>
+          <w:bCs/>
+        </w:rPr>
+        <w:t>ck, kept as is to keep progress.</w:t>
       </w:r>
     </w:p>
     <w:p>
@@ -983,36 +1145,23 @@
         <w:shd w:val="clear" w:color="auto" w:fill="16204F"/>
         <w:spacing w:after="120"/>
         <w:ind w:left="100" w:right="100"/>
-        <w:rPr>
-          <w:rFonts w:ascii="Consolas" w:eastAsia="Consolas" w:hAnsi="Consolas" w:cs="Consolas"/>
-          <w:color w:val="8FD3D6"/>
-        </w:rPr>
-      </w:pPr>
-      <w:r>
-        <w:rPr>
-          <w:b/>
-          <w:bCs/>
-          <w:color w:val="FFFFFF"/>
-        </w:rPr>
-        <w:lastRenderedPageBreak/>
+      </w:pPr>
+      <w:r>
+        <w:rPr>
+          <w:b/>
+          <w:bCs/>
+          <w:color w:val="FFFFFF" w:themeColor="background1"/>
+        </w:rPr>
         <w:t xml:space="preserve">Git URL (commit):  </w:t>
       </w:r>
-      <w:hyperlink r:id="rId9" w:history="1">
-        <w:r>
-          <w:rPr>
-            <w:rStyle w:val="Hyperlink"/>
-            <w:rFonts w:ascii="Consolas" w:eastAsia="Consolas" w:hAnsi="Consolas" w:cs="Consolas"/>
-          </w:rPr>
-          <w:t>https://github.com/team-byte-size/team-page/commit/4a1c9e2</w:t>
-        </w:r>
-      </w:hyperlink>
-    </w:p>
-    <w:p>
-      <w:pPr>
-        <w:shd w:val="clear" w:color="auto" w:fill="16204F"/>
-        <w:spacing w:after="120"/>
-        <w:ind w:left="100" w:right="100"/>
-      </w:pPr>
+      <w:r>
+        <w:rPr>
+          <w:b/>
+          <w:bCs/>
+          <w:color w:val="FFFFFF" w:themeColor="background1"/>
+        </w:rPr>
+        <w:t>https://github.com/emeralddd/capstone-boilerplate/commit/df4749981957bca520db80d084914fbf90b42ec5</w:t>
+      </w:r>
     </w:p>
     <w:p>
       <w:pPr>
@@ -1038,20 +1187,26 @@
       <w:pPr>
         <w:shd w:val="clear" w:color="auto" w:fill="16204F"/>
         <w:spacing w:after="120"/>
-        <w:ind w:left="100" w:right="100"/>
-      </w:pPr>
-      <w:r>
-        <w:rPr>
-          <w:rFonts w:ascii="Times New Roman" w:eastAsia="Times New Roman" w:hAnsi="Times New Roman" w:cs="Times New Roman"/>
+        <w:ind w:right="100"/>
+      </w:pPr>
+      <w:r>
+        <w:rPr>
           <w:noProof/>
-          <w:sz w:val="24"/>
-          <w:szCs w:val="24"/>
-        </w:rPr>
+        </w:rPr>
+        <w:lastRenderedPageBreak/>
         <w:drawing>
-          <wp:inline distT="0" distB="0" distL="0" distR="0" wp14:anchorId="1CF7BDE0" wp14:editId="26C0E66D">
-            <wp:extent cx="3503930" cy="2589530"/>
-            <wp:effectExtent l="0" t="0" r="1270" b="1270"/>
-            <wp:docPr id="1334657175" name="Picture 2"/>
+          <wp:anchor distT="0" distB="0" distL="114300" distR="114300" simplePos="0" relativeHeight="251658240" behindDoc="0" locked="0" layoutInCell="1" allowOverlap="1" wp14:anchorId="44EE2CBD" wp14:editId="4523343B">
+            <wp:simplePos x="0" y="0"/>
+            <wp:positionH relativeFrom="margin">
+              <wp:align>left</wp:align>
+            </wp:positionH>
+            <wp:positionV relativeFrom="paragraph">
+              <wp:posOffset>0</wp:posOffset>
+            </wp:positionV>
+            <wp:extent cx="3238500" cy="3145155"/>
+            <wp:effectExtent l="0" t="0" r="0" b="0"/>
+            <wp:wrapTopAndBottom/>
+            <wp:docPr id="219195653" name="drawing"/>
             <wp:cNvGraphicFramePr>
               <a:graphicFrameLocks xmlns:a="http://schemas.openxmlformats.org/drawingml/2006/main" noChangeAspect="1"/>
             </wp:cNvGraphicFramePr>
@@ -1059,48 +1214,42 @@
               <a:graphicData uri="http://schemas.openxmlformats.org/drawingml/2006/picture">
                 <pic:pic xmlns:pic="http://schemas.openxmlformats.org/drawingml/2006/picture">
                   <pic:nvPicPr>
-                    <pic:cNvPr id="0" name="Picture 3"/>
-                    <pic:cNvPicPr>
-                      <a:picLocks noChangeAspect="1" noChangeArrowheads="1"/>
-                    </pic:cNvPicPr>
+                    <pic:cNvPr id="219195653" name="Picture 219195653"/>
+                    <pic:cNvPicPr/>
                   </pic:nvPicPr>
                   <pic:blipFill>
-                    <a:blip r:embed="rId10">
+                    <a:blip r:embed="rId15" cstate="print">
                       <a:extLst>
                         <a:ext uri="{28A0092B-C50C-407E-A947-70E740481C1C}">
                           <a14:useLocalDpi xmlns:a14="http://schemas.microsoft.com/office/drawing/2010/main" val="0"/>
                         </a:ext>
                       </a:extLst>
                     </a:blip>
-                    <a:srcRect/>
                     <a:stretch>
                       <a:fillRect/>
                     </a:stretch>
                   </pic:blipFill>
-                  <pic:spPr bwMode="auto">
+                  <pic:spPr>
                     <a:xfrm>
                       <a:off x="0" y="0"/>
-                      <a:ext cx="3503930" cy="2589530"/>
+                      <a:ext cx="3238500" cy="3145155"/>
                     </a:xfrm>
                     <a:prstGeom prst="rect">
                       <a:avLst/>
                     </a:prstGeom>
-                    <a:noFill/>
-                    <a:ln>
-                      <a:noFill/>
-                    </a:ln>
                   </pic:spPr>
                 </pic:pic>
               </a:graphicData>
             </a:graphic>
-          </wp:inline>
+            <wp14:sizeRelV relativeFrom="margin">
+              <wp14:pctHeight>0</wp14:pctHeight>
+            </wp14:sizeRelV>
+          </wp:anchor>
         </w:drawing>
       </w:r>
-    </w:p>
-    <w:p>
-      <w:pPr>
-        <w:spacing w:after="260"/>
-      </w:pPr>
+      <w:r>
+        <w:t>(Zoomed out slightly to get all)</w:t>
+      </w:r>
     </w:p>
     <w:p>
       <w:pPr>
@@ -1171,11 +1320,22 @@
             <w:vAlign w:val="center"/>
           </w:tcPr>
           <w:p>
+            <w:pPr>
+              <w:rPr>
+                <w:color w:val="1E2761"/>
+              </w:rPr>
+            </w:pPr>
             <w:r>
               <w:rPr>
                 <w:color w:val="1E2761"/>
               </w:rPr>
               <w:t>Dev 1 —</w:t>
+            </w:r>
+            <w:r>
+              <w:rPr>
+                <w:color w:val="1E2761"/>
+              </w:rPr>
+              <w:t xml:space="preserve"> Kieran Chau</w:t>
             </w:r>
           </w:p>
         </w:tc>
@@ -1205,7 +1365,7 @@
         <w:tc>
           <w:tcPr>
             <w:tcW w:w="2000" w:type="dxa"/>
-            <w:shd w:val="clear" w:color="auto" w:fill="FFFFFF"/>
+            <w:shd w:val="clear" w:color="auto" w:fill="FFFFFF" w:themeFill="background1"/>
             <w:tcMar>
               <w:top w:w="80" w:type="dxa"/>
               <w:left w:w="120" w:type="dxa"/>
@@ -1249,8 +1409,41 @@
         </w:rPr>
         <w:t xml:space="preserve">Done: </w:t>
       </w:r>
-      <w:r>
-        <w:t>Team page built per the design (name, member cards with photo/role, about-us blurb with expand-on-long-text). Login now redirects here on success; team page redirects back to login if accessed directly without a session.</w:t>
+    </w:p>
+    <w:p>
+      <w:pPr>
+        <w:pStyle w:val="ListParagraph"/>
+        <w:numPr>
+          <w:ilvl w:val="0"/>
+          <w:numId w:val="1"/>
+        </w:numPr>
+      </w:pPr>
+      <w:r>
+        <w:t>Cleaned up dashboard</w:t>
+      </w:r>
+    </w:p>
+    <w:p>
+      <w:pPr>
+        <w:pStyle w:val="ListParagraph"/>
+        <w:numPr>
+          <w:ilvl w:val="0"/>
+          <w:numId w:val="1"/>
+        </w:numPr>
+      </w:pPr>
+      <w:r>
+        <w:t>Restyled team page per UI specification</w:t>
+      </w:r>
+    </w:p>
+    <w:p>
+      <w:pPr>
+        <w:pStyle w:val="ListParagraph"/>
+        <w:numPr>
+          <w:ilvl w:val="0"/>
+          <w:numId w:val="1"/>
+        </w:numPr>
+      </w:pPr>
+      <w:r>
+        <w:t>Ensured that team page is automatically redirected to after successful login, otherwise it is not accessible</w:t>
       </w:r>
     </w:p>
     <w:p>
@@ -1280,7 +1473,16 @@
         <w:t xml:space="preserve">Note for next role: </w:t>
       </w:r>
       <w:r>
-        <w:t>Dev 2 — please test against the deployed URL once it's live, not localhost.</w:t>
+        <w:rPr>
+          <w:color w:val="000000" w:themeColor="text1"/>
+        </w:rPr>
+        <w:t>T</w:t>
+      </w:r>
+      <w:r>
+        <w:rPr>
+          <w:color w:val="000000" w:themeColor="text1"/>
+        </w:rPr>
+        <w:t>eam member cards are hardcoded, do we want that? And the profile photo initials are too, cannot currently put a picture inside (if that's something we want).</w:t>
       </w:r>
     </w:p>
     <w:p>
@@ -1293,17 +1495,20 @@
         <w:rPr>
           <w:b/>
           <w:bCs/>
-          <w:color w:val="FFFFFF"/>
+          <w:color w:val="FFFFFF" w:themeColor="background1"/>
         </w:rPr>
         <w:t xml:space="preserve">Git URL (commit):  </w:t>
       </w:r>
-      <w:r>
-        <w:rPr>
-          <w:rFonts w:ascii="Consolas" w:eastAsia="Consolas" w:hAnsi="Consolas" w:cs="Consolas"/>
-          <w:color w:val="8FD3D6"/>
-        </w:rPr>
-        <w:t>https://github.com/team-byte-size/team-page/commit/7f3b8d1</w:t>
-      </w:r>
+      <w:hyperlink r:id="rId16">
+        <w:r>
+          <w:rPr>
+            <w:rStyle w:val="Hyperlink"/>
+            <w:b/>
+            <w:bCs/>
+          </w:rPr>
+          <w:t>https://github.com/emeralddd/capstone-boilerplate/commit/895bb5511319a31d063a22bd2e90db4dbac72fd8</w:t>
+        </w:r>
+      </w:hyperlink>
     </w:p>
     <w:p>
       <w:pPr>
@@ -1315,10 +1520,10 @@
         </w:rPr>
         <w:lastRenderedPageBreak/>
         <w:drawing>
-          <wp:inline distT="0" distB="0" distL="0" distR="0" wp14:anchorId="1D426C83" wp14:editId="65256AE1">
-            <wp:extent cx="3503930" cy="2589530"/>
-            <wp:effectExtent l="0" t="0" r="1270" b="1270"/>
-            <wp:docPr id="845820923" name="Picture 3"/>
+          <wp:inline distT="0" distB="0" distL="0" distR="0" wp14:anchorId="5AE62158" wp14:editId="3244EC2E">
+            <wp:extent cx="5801970" cy="3105541"/>
+            <wp:effectExtent l="0" t="0" r="0" b="0"/>
+            <wp:docPr id="448536912" name="drawing"/>
             <wp:cNvGraphicFramePr>
               <a:graphicFrameLocks xmlns:a="http://schemas.openxmlformats.org/drawingml/2006/main" noChangeAspect="1"/>
             </wp:cNvGraphicFramePr>
@@ -1326,42 +1531,43 @@
               <a:graphicData uri="http://schemas.openxmlformats.org/drawingml/2006/picture">
                 <pic:pic xmlns:pic="http://schemas.openxmlformats.org/drawingml/2006/picture">
                   <pic:nvPicPr>
-                    <pic:cNvPr id="0" name="Picture 5"/>
-                    <pic:cNvPicPr>
-                      <a:picLocks noChangeAspect="1" noChangeArrowheads="1"/>
-                    </pic:cNvPicPr>
+                    <pic:cNvPr id="448536912" name="Picture 448536912"/>
+                    <pic:cNvPicPr/>
                   </pic:nvPicPr>
                   <pic:blipFill>
-                    <a:blip r:embed="rId11">
+                    <a:blip r:embed="rId17">
                       <a:extLst>
                         <a:ext uri="{28A0092B-C50C-407E-A947-70E740481C1C}">
-                          <a14:useLocalDpi xmlns:a14="http://schemas.microsoft.com/office/drawing/2010/main" val="0"/>
+                          <a14:useLocalDpi xmlns:a14="http://schemas.microsoft.com/office/drawing/2010/main"/>
                         </a:ext>
                       </a:extLst>
                     </a:blip>
-                    <a:srcRect/>
                     <a:stretch>
                       <a:fillRect/>
                     </a:stretch>
                   </pic:blipFill>
-                  <pic:spPr bwMode="auto">
+                  <pic:spPr>
                     <a:xfrm>
                       <a:off x="0" y="0"/>
-                      <a:ext cx="3503930" cy="2589530"/>
+                      <a:ext cx="5801970" cy="3105541"/>
                     </a:xfrm>
                     <a:prstGeom prst="rect">
                       <a:avLst/>
                     </a:prstGeom>
-                    <a:noFill/>
-                    <a:ln>
-                      <a:noFill/>
-                    </a:ln>
                   </pic:spPr>
                 </pic:pic>
               </a:graphicData>
             </a:graphic>
           </wp:inline>
         </w:drawing>
+      </w:r>
+    </w:p>
+    <w:p>
+      <w:pPr>
+        <w:spacing w:after="260"/>
+      </w:pPr>
+      <w:r>
+        <w:t>Real output – rendered team page.</w:t>
       </w:r>
     </w:p>
     <w:p>
@@ -1439,6 +1645,12 @@
               </w:rPr>
               <w:t xml:space="preserve">Dev 2 — </w:t>
             </w:r>
+            <w:r>
+              <w:rPr>
+                <w:color w:val="1E2761"/>
+              </w:rPr>
+              <w:t>Rhys Carroll</w:t>
+            </w:r>
           </w:p>
         </w:tc>
         <w:tc>
@@ -1467,7 +1679,7 @@
         <w:tc>
           <w:tcPr>
             <w:tcW w:w="2000" w:type="dxa"/>
-            <w:shd w:val="clear" w:color="auto" w:fill="FFFFFF"/>
+            <w:shd w:val="clear" w:color="auto" w:fill="FFFFFF" w:themeFill="background1"/>
             <w:tcMar>
               <w:top w:w="80" w:type="dxa"/>
               <w:left w:w="120" w:type="dxa"/>
@@ -1477,11 +1689,28 @@
             <w:vAlign w:val="center"/>
           </w:tcPr>
           <w:p>
-            <w:r>
-              <w:rPr>
-                <w:color w:val="1E2761"/>
-              </w:rPr>
-              <w:t>Thursday, 6 August 2026</w:t>
+            <w:pPr>
+              <w:rPr>
+                <w:color w:val="1E2761"/>
+              </w:rPr>
+            </w:pPr>
+            <w:r>
+              <w:rPr>
+                <w:color w:val="1E2761"/>
+              </w:rPr>
+              <w:t xml:space="preserve">Thursday, </w:t>
+            </w:r>
+            <w:r>
+              <w:rPr>
+                <w:color w:val="1E2761"/>
+              </w:rPr>
+              <w:t>13</w:t>
+            </w:r>
+            <w:r>
+              <w:rPr>
+                <w:color w:val="1E2761"/>
+              </w:rPr>
+              <w:t xml:space="preserve"> August 2026</w:t>
             </w:r>
           </w:p>
         </w:tc>
@@ -1512,28 +1741,16 @@
         <w:t xml:space="preserve">Done: </w:t>
       </w:r>
       <w:r>
-        <w:t>Tested the full happy path on the deployed URL — valid login, redirect fires, all member cards render correctly with photo/role/blurb, expand-on-long-text works.</w:t>
-      </w:r>
-    </w:p>
-    <w:p>
-      <w:pPr>
-        <w:spacing w:after="60"/>
-      </w:pPr>
-      <w:r>
-        <w:rPr>
-          <w:b/>
-          <w:bCs/>
-        </w:rPr>
-        <w:t xml:space="preserve">Deliverable: </w:t>
-      </w:r>
-      <w:r>
-        <w:t>Test script and test report.</w:t>
-      </w:r>
-    </w:p>
-    <w:p>
-      <w:pPr>
-        <w:spacing w:after="140"/>
-      </w:pPr>
+        <w:t>Manually t</w:t>
+      </w:r>
+      <w:r>
+        <w:t>ested the full happy path on the deployed URL — valid login, redirect fires, all member cards render correctly with photo/role/blurb</w:t>
+      </w:r>
+      <w:r>
+        <w:t>.</w:t>
+      </w:r>
+    </w:p>
+    <w:p>
       <w:r>
         <w:rPr>
           <w:b/>
@@ -1542,57 +1759,8 @@
         <w:t xml:space="preserve">Note for next role: </w:t>
       </w:r>
       <w:r>
-        <w:t>No issues found on the happy path. Moving on to edge cases next.</w:t>
-      </w:r>
-    </w:p>
-    <w:p>
-      <w:pPr>
-        <w:shd w:val="clear" w:color="auto" w:fill="16204F"/>
-        <w:spacing w:after="120"/>
-        <w:ind w:left="100" w:right="100"/>
-      </w:pPr>
-      <w:r>
-        <w:rPr>
-          <w:b/>
-          <w:bCs/>
-          <w:color w:val="FFFFFF"/>
-        </w:rPr>
-        <w:t xml:space="preserve">Git URL (test script):  </w:t>
-      </w:r>
-      <w:r>
-        <w:rPr>
-          <w:rFonts w:ascii="Consolas" w:eastAsia="Consolas" w:hAnsi="Consolas" w:cs="Consolas"/>
-          <w:color w:val="8FD3D6"/>
-        </w:rPr>
-        <w:t>https://github.com/team-byte-size/team-page/blob/main/tests/flow.spec.js</w:t>
-      </w:r>
-    </w:p>
-    <w:p>
-      <w:pPr>
-        <w:shd w:val="clear" w:color="auto" w:fill="16204F"/>
-        <w:spacing w:after="120"/>
-        <w:ind w:left="100" w:right="100"/>
-      </w:pPr>
-      <w:r>
-        <w:rPr>
-          <w:b/>
-          <w:bCs/>
-          <w:color w:val="FFFFFF"/>
-        </w:rPr>
-        <w:t xml:space="preserve">Git URL (test report):  </w:t>
-      </w:r>
-      <w:r>
-        <w:rPr>
-          <w:rFonts w:ascii="Consolas" w:eastAsia="Consolas" w:hAnsi="Consolas" w:cs="Consolas"/>
-          <w:color w:val="8FD3D6"/>
-        </w:rPr>
-        <w:t>https://github.com/team-byte-size/team-page/blob/main/docs/test-report-flow.md</w:t>
-      </w:r>
-    </w:p>
-    <w:p>
-      <w:pPr>
-        <w:spacing w:after="260"/>
-      </w:pPr>
+        <w:t>Name Rhys Carroll is spelt wrong, as "Rhys Carrol" should be "Rhys Carroll"</w:t>
+      </w:r>
     </w:p>
     <w:p>
       <w:pPr>
@@ -1669,6 +1837,12 @@
               </w:rPr>
               <w:t xml:space="preserve">Dev 2 — </w:t>
             </w:r>
+            <w:r>
+              <w:rPr>
+                <w:color w:val="1E2761"/>
+              </w:rPr>
+              <w:t>Rhys Carroll</w:t>
+            </w:r>
           </w:p>
         </w:tc>
         <w:tc>
@@ -1697,7 +1871,7 @@
         <w:tc>
           <w:tcPr>
             <w:tcW w:w="2000" w:type="dxa"/>
-            <w:shd w:val="clear" w:color="auto" w:fill="FFFFFF"/>
+            <w:shd w:val="clear" w:color="auto" w:fill="FFFFFF" w:themeFill="background1"/>
             <w:tcMar>
               <w:top w:w="80" w:type="dxa"/>
               <w:left w:w="120" w:type="dxa"/>
@@ -1711,7 +1885,19 @@
               <w:rPr>
                 <w:color w:val="1E2761"/>
               </w:rPr>
-              <w:t>Thursday, 6 August 2026</w:t>
+              <w:t xml:space="preserve">Thursday, </w:t>
+            </w:r>
+            <w:r>
+              <w:rPr>
+                <w:color w:val="1E2761"/>
+              </w:rPr>
+              <w:t>13</w:t>
+            </w:r>
+            <w:r>
+              <w:rPr>
+                <w:color w:val="1E2761"/>
+              </w:rPr>
+              <w:t xml:space="preserve"> August 2026</w:t>
             </w:r>
           </w:p>
         </w:tc>
@@ -1747,21 +1933,6 @@
     </w:p>
     <w:p>
       <w:pPr>
-        <w:spacing w:after="60"/>
-      </w:pPr>
-      <w:r>
-        <w:rPr>
-          <w:b/>
-          <w:bCs/>
-        </w:rPr>
-        <w:t xml:space="preserve">Deliverable: </w:t>
-      </w:r>
-      <w:r>
-        <w:t>Edge case test report.</w:t>
-      </w:r>
-    </w:p>
-    <w:p>
-      <w:pPr>
         <w:spacing w:after="140"/>
       </w:pPr>
       <w:r>
@@ -1772,30 +1943,7 @@
         <w:t xml:space="preserve">Note for next role: </w:t>
       </w:r>
       <w:r>
-        <w:t>PM — everything passed, nothing outstanding for Dev 1 to fix before your review.</w:t>
-      </w:r>
-    </w:p>
-    <w:p>
-      <w:pPr>
-        <w:shd w:val="clear" w:color="auto" w:fill="16204F"/>
-        <w:spacing w:after="120"/>
-        <w:ind w:left="100" w:right="100"/>
-      </w:pPr>
-      <w:r>
-        <w:rPr>
-          <w:b/>
-          <w:bCs/>
-          <w:color w:val="FFFFFF"/>
-        </w:rPr>
-        <w:lastRenderedPageBreak/>
-        <w:t xml:space="preserve">Git URL (test script):  </w:t>
-      </w:r>
-      <w:r>
-        <w:rPr>
-          <w:rFonts w:ascii="Consolas" w:eastAsia="Consolas" w:hAnsi="Consolas" w:cs="Consolas"/>
-          <w:color w:val="8FD3D6"/>
-        </w:rPr>
-        <w:t>https://github.com/team-byte-size/team-page/blob/main/tests/edge.spec.js</w:t>
+        <w:t>Unusually long blurb missing “see more” feature, just continues expanding component size.</w:t>
       </w:r>
     </w:p>
     <w:tbl>
@@ -1842,22 +1990,51 @@
             </w:pPr>
             <w:r>
               <w:rPr>
-                <w:i/>
-                <w:iCs/>
-                <w:color w:val="888888"/>
-              </w:rPr>
-              <w:t xml:space="preserve">[ IMAGE PLACEHOLDER — Invalid login error state screenshot — replace with actual </w:t>
-            </w:r>
-            <w:proofErr w:type="gramStart"/>
-            <w:r>
-              <w:rPr>
-                <w:i/>
-                <w:iCs/>
-                <w:color w:val="888888"/>
-              </w:rPr>
-              <w:t>screenshot ]</w:t>
-            </w:r>
-            <w:proofErr w:type="gramEnd"/>
+                <w:noProof/>
+              </w:rPr>
+              <w:lastRenderedPageBreak/>
+              <w:drawing>
+                <wp:inline distT="0" distB="0" distL="0" distR="0" wp14:anchorId="2289CA13" wp14:editId="14AA4873">
+                  <wp:extent cx="5457825" cy="3667125"/>
+                  <wp:effectExtent l="0" t="0" r="0" b="0"/>
+                  <wp:docPr id="1431739511" name="drawing"/>
+                  <wp:cNvGraphicFramePr>
+                    <a:graphicFrameLocks xmlns:a="http://schemas.openxmlformats.org/drawingml/2006/main" noChangeAspect="1"/>
+                  </wp:cNvGraphicFramePr>
+                  <a:graphic xmlns:a="http://schemas.openxmlformats.org/drawingml/2006/main">
+                    <a:graphicData uri="http://schemas.openxmlformats.org/drawingml/2006/picture">
+                      <pic:pic xmlns:pic="http://schemas.openxmlformats.org/drawingml/2006/picture">
+                        <pic:nvPicPr>
+                          <pic:cNvPr id="1431739511" name="Picture 1431739511"/>
+                          <pic:cNvPicPr/>
+                        </pic:nvPicPr>
+                        <pic:blipFill>
+                          <a:blip r:embed="rId18">
+                            <a:extLst>
+                              <a:ext uri="{28A0092B-C50C-407E-A947-70E740481C1C}">
+                                <a14:useLocalDpi xmlns:a14="http://schemas.microsoft.com/office/drawing/2010/main"/>
+                              </a:ext>
+                            </a:extLst>
+                          </a:blip>
+                          <a:stretch>
+                            <a:fillRect/>
+                          </a:stretch>
+                        </pic:blipFill>
+                        <pic:spPr>
+                          <a:xfrm>
+                            <a:off x="0" y="0"/>
+                            <a:ext cx="5457825" cy="3667125"/>
+                          </a:xfrm>
+                          <a:prstGeom prst="rect">
+                            <a:avLst/>
+                          </a:prstGeom>
+                        </pic:spPr>
+                      </pic:pic>
+                    </a:graphicData>
+                  </a:graphic>
+                </wp:inline>
+              </w:drawing>
+            </w:r>
           </w:p>
         </w:tc>
       </w:tr>
@@ -1873,7 +2050,10 @@
         <w:spacing w:before="320" w:after="140"/>
       </w:pPr>
       <w:r>
-        <w:t>[Login Restyling Bootstrap] Task 8 — Final Review &amp; Sign-Off</w:t>
+        <w:t xml:space="preserve">[Login Restyling Bootstrap] Task 8 — </w:t>
+      </w:r>
+      <w:r>
+        <w:t>Deploy</w:t>
       </w:r>
     </w:p>
     <w:tbl>
@@ -1937,10 +2117,7 @@
           </w:tcPr>
           <w:p>
             <w:r>
-              <w:rPr>
-                <w:color w:val="1E2761"/>
-              </w:rPr>
-              <w:t xml:space="preserve">PM — </w:t>
+              <w:t>Dev – Kieran Chau</w:t>
             </w:r>
           </w:p>
         </w:tc>
@@ -1984,7 +2161,25 @@
               <w:rPr>
                 <w:color w:val="1E2761"/>
               </w:rPr>
-              <w:t>Friday, 7 August 2026</w:t>
+              <w:t>Thursday</w:t>
+            </w:r>
+            <w:r>
+              <w:rPr>
+                <w:color w:val="1E2761"/>
+              </w:rPr>
+              <w:t xml:space="preserve">, </w:t>
+            </w:r>
+            <w:r>
+              <w:rPr>
+                <w:color w:val="1E2761"/>
+              </w:rPr>
+              <w:t>13</w:t>
+            </w:r>
+            <w:r>
+              <w:rPr>
+                <w:color w:val="1E2761"/>
+              </w:rPr>
+              <w:t xml:space="preserve"> August 2026</w:t>
             </w:r>
           </w:p>
         </w:tc>
@@ -2012,6 +2207,239 @@
           <w:b/>
           <w:bCs/>
         </w:rPr>
+        <w:t>Done</w:t>
+      </w:r>
+      <w:r>
+        <w:rPr>
+          <w:b/>
+          <w:bCs/>
+        </w:rPr>
+        <w:t xml:space="preserve">: </w:t>
+      </w:r>
+      <w:r>
+        <w:t>Deploy</w:t>
+      </w:r>
+      <w:r>
+        <w:t>ed</w:t>
+      </w:r>
+      <w:r>
+        <w:t xml:space="preserve"> website to </w:t>
+      </w:r>
+      <w:proofErr w:type="spellStart"/>
+      <w:r>
+        <w:t>Vercel</w:t>
+      </w:r>
+      <w:proofErr w:type="spellEnd"/>
+      <w:r>
+        <w:t>.</w:t>
+      </w:r>
+    </w:p>
+    <w:p>
+      <w:pPr>
+        <w:spacing w:after="60"/>
+      </w:pPr>
+      <w:r>
+        <w:rPr>
+          <w:b/>
+          <w:bCs/>
+        </w:rPr>
+        <w:t xml:space="preserve">Deliverable: </w:t>
+      </w:r>
+      <w:r>
+        <w:t xml:space="preserve">Link to website: </w:t>
+      </w:r>
+      <w:hyperlink r:id="rId19" w:history="1">
+        <w:r>
+          <w:rPr>
+            <w:rStyle w:val="Hyperlink"/>
+          </w:rPr>
+          <w:t>https://capstone-boilerplate-frontend.vercel.app/</w:t>
+        </w:r>
+      </w:hyperlink>
+      <w:r>
+        <w:t xml:space="preserve"> </w:t>
+      </w:r>
+      <w:r>
+        <w:t>.</w:t>
+      </w:r>
+    </w:p>
+    <w:p>
+      <w:pPr>
+        <w:spacing w:after="140"/>
+      </w:pPr>
+      <w:r>
+        <w:rPr>
+          <w:b/>
+          <w:bCs/>
+        </w:rPr>
+        <w:t xml:space="preserve">Note for next role: </w:t>
+      </w:r>
+      <w:r>
+        <w:t>None.</w:t>
+      </w:r>
+    </w:p>
+    <w:p>
+      <w:pPr>
+        <w:pStyle w:val="Heading1"/>
+        <w:spacing w:before="320" w:after="140"/>
+      </w:pPr>
+      <w:r>
+        <w:br/>
+      </w:r>
+      <w:r>
+        <w:t xml:space="preserve">[Login Restyling Bootstrap] Task </w:t>
+      </w:r>
+      <w:r>
+        <w:t>9</w:t>
+      </w:r>
+      <w:r>
+        <w:t xml:space="preserve"> — Final Review &amp; Sign-Off</w:t>
+      </w:r>
+    </w:p>
+    <w:tbl>
+      <w:tblPr>
+        <w:tblW w:w="9000" w:type="dxa"/>
+        <w:tblBorders>
+          <w:top w:val="single" w:sz="4" w:space="0" w:color="auto"/>
+          <w:left w:val="single" w:sz="4" w:space="0" w:color="auto"/>
+          <w:bottom w:val="single" w:sz="4" w:space="0" w:color="auto"/>
+          <w:right w:val="single" w:sz="4" w:space="0" w:color="auto"/>
+          <w:insideH w:val="single" w:sz="4" w:space="0" w:color="auto"/>
+          <w:insideV w:val="single" w:sz="4" w:space="0" w:color="auto"/>
+        </w:tblBorders>
+        <w:tblCellMar>
+          <w:left w:w="10" w:type="dxa"/>
+          <w:right w:w="10" w:type="dxa"/>
+        </w:tblCellMar>
+        <w:tblLook w:val="0000" w:firstRow="0" w:lastRow="0" w:firstColumn="0" w:lastColumn="0" w:noHBand="0" w:noVBand="0"/>
+      </w:tblPr>
+      <w:tblGrid>
+        <w:gridCol w:w="1800"/>
+        <w:gridCol w:w="3600"/>
+        <w:gridCol w:w="1600"/>
+        <w:gridCol w:w="2000"/>
+      </w:tblGrid>
+      <w:tr>
+        <w:tc>
+          <w:tcPr>
+            <w:tcW w:w="1800" w:type="dxa"/>
+            <w:shd w:val="clear" w:color="auto" w:fill="F3F6FC"/>
+            <w:tcMar>
+              <w:top w:w="80" w:type="dxa"/>
+              <w:left w:w="120" w:type="dxa"/>
+              <w:bottom w:w="80" w:type="dxa"/>
+              <w:right w:w="120" w:type="dxa"/>
+            </w:tcMar>
+            <w:vAlign w:val="center"/>
+          </w:tcPr>
+          <w:p>
+            <w:r>
+              <w:rPr>
+                <w:b/>
+                <w:bCs/>
+                <w:color w:val="1E2761"/>
+              </w:rPr>
+              <w:t>R</w:t>
+            </w:r>
+            <w:r>
+              <w:rPr>
+                <w:b/>
+                <w:bCs/>
+                <w:color w:val="1E2761"/>
+              </w:rPr>
+              <w:t>ole</w:t>
+            </w:r>
+          </w:p>
+        </w:tc>
+        <w:tc>
+          <w:tcPr>
+            <w:tcW w:w="3600" w:type="dxa"/>
+            <w:shd w:val="clear" w:color="auto" w:fill="89B4FA"/>
+            <w:tcMar>
+              <w:top w:w="80" w:type="dxa"/>
+              <w:left w:w="120" w:type="dxa"/>
+              <w:bottom w:w="80" w:type="dxa"/>
+              <w:right w:w="120" w:type="dxa"/>
+            </w:tcMar>
+            <w:vAlign w:val="center"/>
+          </w:tcPr>
+          <w:p>
+            <w:r>
+              <w:rPr>
+                <w:color w:val="1E2761"/>
+              </w:rPr>
+              <w:t xml:space="preserve">PM — </w:t>
+            </w:r>
+          </w:p>
+        </w:tc>
+        <w:tc>
+          <w:tcPr>
+            <w:tcW w:w="1600" w:type="dxa"/>
+            <w:shd w:val="clear" w:color="auto" w:fill="F3F6FC"/>
+            <w:tcMar>
+              <w:top w:w="80" w:type="dxa"/>
+              <w:left w:w="120" w:type="dxa"/>
+              <w:bottom w:w="80" w:type="dxa"/>
+              <w:right w:w="120" w:type="dxa"/>
+            </w:tcMar>
+            <w:vAlign w:val="center"/>
+          </w:tcPr>
+          <w:p>
+            <w:r>
+              <w:rPr>
+                <w:b/>
+                <w:bCs/>
+                <w:color w:val="1E2761"/>
+              </w:rPr>
+              <w:t>Date</w:t>
+            </w:r>
+          </w:p>
+        </w:tc>
+        <w:tc>
+          <w:tcPr>
+            <w:tcW w:w="2000" w:type="dxa"/>
+            <w:shd w:val="clear" w:color="auto" w:fill="FFFFFF"/>
+            <w:tcMar>
+              <w:top w:w="80" w:type="dxa"/>
+              <w:left w:w="120" w:type="dxa"/>
+              <w:bottom w:w="80" w:type="dxa"/>
+              <w:right w:w="120" w:type="dxa"/>
+            </w:tcMar>
+            <w:vAlign w:val="center"/>
+          </w:tcPr>
+          <w:p>
+            <w:r>
+              <w:rPr>
+                <w:color w:val="1E2761"/>
+              </w:rPr>
+              <w:t>Friday, 7 August 2026</w:t>
+            </w:r>
+          </w:p>
+        </w:tc>
+      </w:tr>
+    </w:tbl>
+    <w:p>
+      <w:pPr>
+        <w:spacing w:before="160" w:after="40"/>
+      </w:pPr>
+      <w:r>
+        <w:rPr>
+          <w:b/>
+          <w:bCs/>
+          <w:color w:val="1E2761"/>
+        </w:rPr>
+        <w:t>Completion comment</w:t>
+      </w:r>
+    </w:p>
+    <w:p>
+      <w:pPr>
+        <w:spacing w:after="60"/>
+      </w:pPr>
+      <w:r>
+        <w:rPr>
+          <w:b/>
+          <w:bCs/>
+        </w:rPr>
         <w:t xml:space="preserve">Done: </w:t>
       </w:r>
       <w:r>
@@ -2042,6 +2470,7 @@
           <w:b/>
           <w:bCs/>
         </w:rPr>
+        <w:lastRenderedPageBreak/>
         <w:t xml:space="preserve">Note for next role: </w:t>
       </w:r>
       <w:r>
@@ -2050,33 +2479,1378 @@
     </w:p>
     <w:p>
       <w:pPr>
-        <w:shd w:val="clear" w:color="auto" w:fill="16204F"/>
-        <w:spacing w:after="120"/>
-        <w:ind w:left="100" w:right="100"/>
-      </w:pPr>
-      <w:r>
-        <w:rPr>
-          <w:b/>
-          <w:bCs/>
-          <w:color w:val="FFFFFF"/>
-        </w:rPr>
-        <w:t xml:space="preserve">Git URL:  </w:t>
-      </w:r>
-      <w:r>
-        <w:rPr>
-          <w:rFonts w:ascii="Consolas" w:eastAsia="Consolas" w:hAnsi="Consolas" w:cs="Consolas"/>
-          <w:color w:val="8FD3D6"/>
-        </w:rPr>
-        <w:t>https://github.com/team-byte-size/team-page/blob/main/docs/signoff.md</w:t>
-      </w:r>
-    </w:p>
-    <w:p>
-      <w:pPr>
-        <w:spacing w:after="260"/>
+        <w:pStyle w:val="Heading1"/>
+        <w:spacing w:before="320" w:after="140"/>
+      </w:pPr>
+      <w:r>
+        <w:br/>
+      </w:r>
+      <w:r>
+        <w:t>[</w:t>
+      </w:r>
+      <w:r>
+        <w:t>PROJECT PROTOTYPING</w:t>
+      </w:r>
+      <w:r>
+        <w:t xml:space="preserve">] Task </w:t>
+      </w:r>
+      <w:r>
+        <w:t>10</w:t>
+      </w:r>
+      <w:r>
+        <w:t xml:space="preserve"> — </w:t>
+      </w:r>
+      <w:r>
+        <w:t>First Client Meeting</w:t>
+      </w:r>
+    </w:p>
+    <w:tbl>
+      <w:tblPr>
+        <w:tblW w:w="9000" w:type="dxa"/>
+        <w:tblBorders>
+          <w:top w:val="single" w:sz="4" w:space="0" w:color="auto"/>
+          <w:left w:val="single" w:sz="4" w:space="0" w:color="auto"/>
+          <w:bottom w:val="single" w:sz="4" w:space="0" w:color="auto"/>
+          <w:right w:val="single" w:sz="4" w:space="0" w:color="auto"/>
+          <w:insideH w:val="single" w:sz="4" w:space="0" w:color="auto"/>
+          <w:insideV w:val="single" w:sz="4" w:space="0" w:color="auto"/>
+        </w:tblBorders>
+        <w:tblCellMar>
+          <w:left w:w="10" w:type="dxa"/>
+          <w:right w:w="10" w:type="dxa"/>
+        </w:tblCellMar>
+        <w:tblLook w:val="0000" w:firstRow="0" w:lastRow="0" w:firstColumn="0" w:lastColumn="0" w:noHBand="0" w:noVBand="0"/>
+      </w:tblPr>
+      <w:tblGrid>
+        <w:gridCol w:w="1800"/>
+        <w:gridCol w:w="3600"/>
+        <w:gridCol w:w="1600"/>
+        <w:gridCol w:w="2000"/>
+      </w:tblGrid>
+      <w:tr>
+        <w:tc>
+          <w:tcPr>
+            <w:tcW w:w="1800" w:type="dxa"/>
+            <w:shd w:val="clear" w:color="auto" w:fill="F3F6FC"/>
+            <w:tcMar>
+              <w:top w:w="80" w:type="dxa"/>
+              <w:left w:w="120" w:type="dxa"/>
+              <w:bottom w:w="80" w:type="dxa"/>
+              <w:right w:w="120" w:type="dxa"/>
+            </w:tcMar>
+            <w:vAlign w:val="center"/>
+          </w:tcPr>
+          <w:p>
+            <w:r>
+              <w:rPr>
+                <w:b/>
+                <w:bCs/>
+                <w:color w:val="1E2761"/>
+              </w:rPr>
+              <w:t>Role</w:t>
+            </w:r>
+          </w:p>
+        </w:tc>
+        <w:tc>
+          <w:tcPr>
+            <w:tcW w:w="3600" w:type="dxa"/>
+            <w:shd w:val="clear" w:color="auto" w:fill="89B4FA"/>
+            <w:tcMar>
+              <w:top w:w="80" w:type="dxa"/>
+              <w:left w:w="120" w:type="dxa"/>
+              <w:bottom w:w="80" w:type="dxa"/>
+              <w:right w:w="120" w:type="dxa"/>
+            </w:tcMar>
+            <w:vAlign w:val="center"/>
+          </w:tcPr>
+          <w:p>
+            <w:r>
+              <w:rPr>
+                <w:color w:val="1E2761"/>
+              </w:rPr>
+              <w:t>Everyone</w:t>
+            </w:r>
+          </w:p>
+        </w:tc>
+        <w:tc>
+          <w:tcPr>
+            <w:tcW w:w="1600" w:type="dxa"/>
+            <w:shd w:val="clear" w:color="auto" w:fill="F3F6FC"/>
+            <w:tcMar>
+              <w:top w:w="80" w:type="dxa"/>
+              <w:left w:w="120" w:type="dxa"/>
+              <w:bottom w:w="80" w:type="dxa"/>
+              <w:right w:w="120" w:type="dxa"/>
+            </w:tcMar>
+            <w:vAlign w:val="center"/>
+          </w:tcPr>
+          <w:p>
+            <w:r>
+              <w:rPr>
+                <w:b/>
+                <w:bCs/>
+                <w:color w:val="1E2761"/>
+              </w:rPr>
+              <w:t>Date</w:t>
+            </w:r>
+          </w:p>
+        </w:tc>
+        <w:tc>
+          <w:tcPr>
+            <w:tcW w:w="2000" w:type="dxa"/>
+            <w:shd w:val="clear" w:color="auto" w:fill="FFFFFF"/>
+            <w:tcMar>
+              <w:top w:w="80" w:type="dxa"/>
+              <w:left w:w="120" w:type="dxa"/>
+              <w:bottom w:w="80" w:type="dxa"/>
+              <w:right w:w="120" w:type="dxa"/>
+            </w:tcMar>
+            <w:vAlign w:val="center"/>
+          </w:tcPr>
+          <w:p>
+            <w:r>
+              <w:rPr>
+                <w:color w:val="1E2761"/>
+              </w:rPr>
+              <w:t>Monday</w:t>
+            </w:r>
+            <w:r>
+              <w:rPr>
+                <w:color w:val="1E2761"/>
+              </w:rPr>
+              <w:t xml:space="preserve">, </w:t>
+            </w:r>
+            <w:r>
+              <w:rPr>
+                <w:color w:val="1E2761"/>
+              </w:rPr>
+              <w:t>10</w:t>
+            </w:r>
+            <w:r>
+              <w:rPr>
+                <w:color w:val="1E2761"/>
+              </w:rPr>
+              <w:t xml:space="preserve"> August 2026</w:t>
+            </w:r>
+          </w:p>
+        </w:tc>
+      </w:tr>
+    </w:tbl>
+    <w:p>
+      <w:pPr>
+        <w:spacing w:before="160" w:after="40"/>
+      </w:pPr>
+      <w:r>
+        <w:rPr>
+          <w:b/>
+          <w:bCs/>
+          <w:color w:val="1E2761"/>
+        </w:rPr>
+        <w:t>Completion comment</w:t>
+      </w:r>
+    </w:p>
+    <w:p>
+      <w:pPr>
+        <w:rPr>
+          <w:color w:val="000000"/>
+        </w:rPr>
+      </w:pPr>
+      <w:r>
+        <w:rPr>
+          <w:color w:val="000000"/>
+        </w:rPr>
+        <w:t>Done: We met with Alessio to get information about the project.</w:t>
+      </w:r>
+    </w:p>
+    <w:p>
+      <w:pPr>
+        <w:rPr>
+          <w:color w:val="000000"/>
+        </w:rPr>
+      </w:pPr>
+      <w:r>
+        <w:rPr>
+          <w:color w:val="000000"/>
+        </w:rPr>
+        <w:t>Deliverable:</w:t>
+      </w:r>
+    </w:p>
+    <w:p>
+      <w:pPr>
+        <w:numPr>
+          <w:ilvl w:val="0"/>
+          <w:numId w:val="5"/>
+        </w:numPr>
+        <w:spacing w:before="100" w:beforeAutospacing="1" w:after="100" w:afterAutospacing="1"/>
+        <w:rPr>
+          <w:color w:val="000000"/>
+        </w:rPr>
+      </w:pPr>
+      <w:r>
+        <w:rPr>
+          <w:color w:val="000000"/>
+        </w:rPr>
+        <w:t xml:space="preserve">Meeting Minutes: </w:t>
+      </w:r>
+      <w:hyperlink r:id="rId20" w:history="1">
+        <w:r>
+          <w:rPr>
+            <w:rStyle w:val="Hyperlink"/>
+          </w:rPr>
+          <w:t>2026-08-10_Client Meeting Session.docx</w:t>
+        </w:r>
+      </w:hyperlink>
+    </w:p>
+    <w:p>
+      <w:pPr>
+        <w:numPr>
+          <w:ilvl w:val="0"/>
+          <w:numId w:val="5"/>
+        </w:numPr>
+        <w:spacing w:before="100" w:beforeAutospacing="1" w:after="100" w:afterAutospacing="1"/>
+        <w:rPr>
+          <w:color w:val="000000"/>
+        </w:rPr>
+      </w:pPr>
+      <w:r>
+        <w:rPr>
+          <w:color w:val="000000"/>
+        </w:rPr>
+        <w:t xml:space="preserve">Proposal: </w:t>
+      </w:r>
+      <w:hyperlink r:id="rId21" w:history="1">
+        <w:r>
+          <w:rPr>
+            <w:rStyle w:val="Hyperlink"/>
+          </w:rPr>
+          <w:t>Client Proposal and Sprint 1 Plan.docx</w:t>
+        </w:r>
+      </w:hyperlink>
+    </w:p>
+    <w:p>
+      <w:pPr>
+        <w:rPr>
+          <w:color w:val="000000"/>
+        </w:rPr>
+      </w:pPr>
+      <w:r>
+        <w:rPr>
+          <w:color w:val="000000"/>
+        </w:rPr>
+        <w:t>Note for next role: Work on the Planning from Proposal.</w:t>
+      </w:r>
+    </w:p>
+    <w:p>
+      <w:pPr>
+        <w:pStyle w:val="Heading1"/>
+        <w:spacing w:before="320" w:after="140"/>
+      </w:pPr>
+      <w:r>
+        <w:t>[</w:t>
+      </w:r>
+      <w:r>
+        <w:t>Login Restyling Bootstrap</w:t>
+      </w:r>
+      <w:r>
+        <w:t xml:space="preserve">] Task </w:t>
+      </w:r>
+      <w:r>
+        <w:t>1</w:t>
+      </w:r>
+      <w:r>
+        <w:t>1</w:t>
+      </w:r>
+      <w:r>
+        <w:t xml:space="preserve"> — </w:t>
+      </w:r>
+      <w:r>
+        <w:t>Internal</w:t>
+      </w:r>
+      <w:r>
+        <w:t xml:space="preserve"> Team</w:t>
+      </w:r>
+      <w:r>
+        <w:t xml:space="preserve"> Meeting</w:t>
+      </w:r>
+    </w:p>
+    <w:tbl>
+      <w:tblPr>
+        <w:tblW w:w="9000" w:type="dxa"/>
+        <w:tblBorders>
+          <w:top w:val="single" w:sz="4" w:space="0" w:color="auto"/>
+          <w:left w:val="single" w:sz="4" w:space="0" w:color="auto"/>
+          <w:bottom w:val="single" w:sz="4" w:space="0" w:color="auto"/>
+          <w:right w:val="single" w:sz="4" w:space="0" w:color="auto"/>
+          <w:insideH w:val="single" w:sz="4" w:space="0" w:color="auto"/>
+          <w:insideV w:val="single" w:sz="4" w:space="0" w:color="auto"/>
+        </w:tblBorders>
+        <w:tblCellMar>
+          <w:left w:w="10" w:type="dxa"/>
+          <w:right w:w="10" w:type="dxa"/>
+        </w:tblCellMar>
+        <w:tblLook w:val="0000" w:firstRow="0" w:lastRow="0" w:firstColumn="0" w:lastColumn="0" w:noHBand="0" w:noVBand="0"/>
+      </w:tblPr>
+      <w:tblGrid>
+        <w:gridCol w:w="1800"/>
+        <w:gridCol w:w="3600"/>
+        <w:gridCol w:w="1600"/>
+        <w:gridCol w:w="2000"/>
+      </w:tblGrid>
+      <w:tr>
+        <w:tc>
+          <w:tcPr>
+            <w:tcW w:w="1800" w:type="dxa"/>
+            <w:shd w:val="clear" w:color="auto" w:fill="F3F6FC"/>
+            <w:tcMar>
+              <w:top w:w="80" w:type="dxa"/>
+              <w:left w:w="120" w:type="dxa"/>
+              <w:bottom w:w="80" w:type="dxa"/>
+              <w:right w:w="120" w:type="dxa"/>
+            </w:tcMar>
+            <w:vAlign w:val="center"/>
+          </w:tcPr>
+          <w:p>
+            <w:r>
+              <w:rPr>
+                <w:b/>
+                <w:bCs/>
+                <w:color w:val="1E2761"/>
+              </w:rPr>
+              <w:t>Role</w:t>
+            </w:r>
+          </w:p>
+        </w:tc>
+        <w:tc>
+          <w:tcPr>
+            <w:tcW w:w="3600" w:type="dxa"/>
+            <w:shd w:val="clear" w:color="auto" w:fill="89B4FA"/>
+            <w:tcMar>
+              <w:top w:w="80" w:type="dxa"/>
+              <w:left w:w="120" w:type="dxa"/>
+              <w:bottom w:w="80" w:type="dxa"/>
+              <w:right w:w="120" w:type="dxa"/>
+            </w:tcMar>
+            <w:vAlign w:val="center"/>
+          </w:tcPr>
+          <w:p>
+            <w:r>
+              <w:rPr>
+                <w:color w:val="1E2761"/>
+              </w:rPr>
+              <w:t>Everyone</w:t>
+            </w:r>
+          </w:p>
+        </w:tc>
+        <w:tc>
+          <w:tcPr>
+            <w:tcW w:w="1600" w:type="dxa"/>
+            <w:shd w:val="clear" w:color="auto" w:fill="F3F6FC"/>
+            <w:tcMar>
+              <w:top w:w="80" w:type="dxa"/>
+              <w:left w:w="120" w:type="dxa"/>
+              <w:bottom w:w="80" w:type="dxa"/>
+              <w:right w:w="120" w:type="dxa"/>
+            </w:tcMar>
+            <w:vAlign w:val="center"/>
+          </w:tcPr>
+          <w:p>
+            <w:r>
+              <w:rPr>
+                <w:b/>
+                <w:bCs/>
+                <w:color w:val="1E2761"/>
+              </w:rPr>
+              <w:t>Date</w:t>
+            </w:r>
+          </w:p>
+        </w:tc>
+        <w:tc>
+          <w:tcPr>
+            <w:tcW w:w="2000" w:type="dxa"/>
+            <w:shd w:val="clear" w:color="auto" w:fill="FFFFFF"/>
+            <w:tcMar>
+              <w:top w:w="80" w:type="dxa"/>
+              <w:left w:w="120" w:type="dxa"/>
+              <w:bottom w:w="80" w:type="dxa"/>
+              <w:right w:w="120" w:type="dxa"/>
+            </w:tcMar>
+            <w:vAlign w:val="center"/>
+          </w:tcPr>
+          <w:p>
+            <w:r>
+              <w:rPr>
+                <w:color w:val="1E2761"/>
+              </w:rPr>
+              <w:t>Friday</w:t>
+            </w:r>
+            <w:r>
+              <w:rPr>
+                <w:color w:val="1E2761"/>
+              </w:rPr>
+              <w:t xml:space="preserve">, </w:t>
+            </w:r>
+            <w:r>
+              <w:rPr>
+                <w:color w:val="1E2761"/>
+              </w:rPr>
+              <w:t xml:space="preserve">5 </w:t>
+            </w:r>
+            <w:r>
+              <w:rPr>
+                <w:color w:val="1E2761"/>
+              </w:rPr>
+              <w:t>August 2026</w:t>
+            </w:r>
+          </w:p>
+        </w:tc>
+      </w:tr>
+    </w:tbl>
+    <w:p>
+      <w:pPr>
+        <w:spacing w:before="160" w:after="40"/>
+      </w:pPr>
+      <w:r>
+        <w:rPr>
+          <w:b/>
+          <w:bCs/>
+          <w:color w:val="1E2761"/>
+        </w:rPr>
+        <w:t>Completion comment</w:t>
+      </w:r>
+    </w:p>
+    <w:p>
+      <w:pPr>
+        <w:rPr>
+          <w:color w:val="000000"/>
+        </w:rPr>
+      </w:pPr>
+      <w:r>
+        <w:rPr>
+          <w:b/>
+          <w:bCs/>
+          <w:color w:val="000000"/>
+        </w:rPr>
+        <w:t>Done</w:t>
+      </w:r>
+      <w:r>
+        <w:rPr>
+          <w:color w:val="000000"/>
+        </w:rPr>
+        <w:t xml:space="preserve">: </w:t>
+      </w:r>
+      <w:r>
+        <w:rPr>
+          <w:color w:val="000000"/>
+        </w:rPr>
+        <w:t>Introduction about each member and task assignments for demo sprint.</w:t>
+      </w:r>
+    </w:p>
+    <w:p>
+      <w:pPr>
+        <w:rPr>
+          <w:color w:val="000000"/>
+        </w:rPr>
+      </w:pPr>
+      <w:r>
+        <w:rPr>
+          <w:b/>
+          <w:bCs/>
+          <w:color w:val="000000"/>
+        </w:rPr>
+        <w:t>Deliverable</w:t>
+      </w:r>
+      <w:r>
+        <w:rPr>
+          <w:color w:val="000000"/>
+        </w:rPr>
+        <w:t>:</w:t>
+      </w:r>
+    </w:p>
+    <w:p>
+      <w:pPr>
+        <w:numPr>
+          <w:ilvl w:val="0"/>
+          <w:numId w:val="5"/>
+        </w:numPr>
+        <w:spacing w:before="100" w:beforeAutospacing="1" w:after="100" w:afterAutospacing="1"/>
+        <w:rPr>
+          <w:color w:val="000000"/>
+          <w:lang w:val="en-ID"/>
+        </w:rPr>
+      </w:pPr>
+      <w:r>
+        <w:rPr>
+          <w:color w:val="000000"/>
+        </w:rPr>
+        <w:t xml:space="preserve">Meeting Minutes: </w:t>
+      </w:r>
+      <w:hyperlink r:id="rId22" w:history="1">
+        <w:r>
+          <w:rPr>
+            <w:rStyle w:val="Hyperlink"/>
+            <w:lang w:val="en-ID"/>
+          </w:rPr>
+          <w:t>2026-08-06_MiniSprint Planning Session.docx</w:t>
+        </w:r>
+      </w:hyperlink>
+    </w:p>
+    <w:p>
+      <w:pPr>
+        <w:rPr>
+          <w:color w:val="000000"/>
+        </w:rPr>
+      </w:pPr>
+      <w:r>
+        <w:rPr>
+          <w:b/>
+          <w:bCs/>
+          <w:color w:val="000000"/>
+        </w:rPr>
+        <w:t>Note for next role</w:t>
+      </w:r>
+      <w:r>
+        <w:rPr>
+          <w:color w:val="000000"/>
+        </w:rPr>
+        <w:t xml:space="preserve">: </w:t>
+      </w:r>
+      <w:r>
+        <w:rPr>
+          <w:color w:val="000000"/>
+        </w:rPr>
+        <w:t>Work on each member task based on assignments</w:t>
+      </w:r>
+      <w:r>
+        <w:rPr>
+          <w:color w:val="000000"/>
+        </w:rPr>
+        <w:t>.</w:t>
+      </w:r>
+    </w:p>
+    <w:p>
+      <w:pPr>
+        <w:pStyle w:val="Heading1"/>
+        <w:spacing w:before="320" w:after="140"/>
+      </w:pPr>
+      <w:r>
+        <w:t>[</w:t>
+      </w:r>
+      <w:r>
+        <w:t>PROJECT PROTOTYPING</w:t>
+      </w:r>
+      <w:r>
+        <w:t>] Task 1</w:t>
+      </w:r>
+      <w:r>
+        <w:t>2</w:t>
+      </w:r>
+      <w:r>
+        <w:t xml:space="preserve"> — </w:t>
+      </w:r>
+      <w:r>
+        <w:t>Supervisor</w:t>
+      </w:r>
+      <w:r>
+        <w:t xml:space="preserve"> Meeting</w:t>
+      </w:r>
+    </w:p>
+    <w:tbl>
+      <w:tblPr>
+        <w:tblW w:w="9000" w:type="dxa"/>
+        <w:tblBorders>
+          <w:top w:val="single" w:sz="4" w:space="0" w:color="auto"/>
+          <w:left w:val="single" w:sz="4" w:space="0" w:color="auto"/>
+          <w:bottom w:val="single" w:sz="4" w:space="0" w:color="auto"/>
+          <w:right w:val="single" w:sz="4" w:space="0" w:color="auto"/>
+          <w:insideH w:val="single" w:sz="4" w:space="0" w:color="auto"/>
+          <w:insideV w:val="single" w:sz="4" w:space="0" w:color="auto"/>
+        </w:tblBorders>
+        <w:tblCellMar>
+          <w:left w:w="10" w:type="dxa"/>
+          <w:right w:w="10" w:type="dxa"/>
+        </w:tblCellMar>
+        <w:tblLook w:val="0000" w:firstRow="0" w:lastRow="0" w:firstColumn="0" w:lastColumn="0" w:noHBand="0" w:noVBand="0"/>
+      </w:tblPr>
+      <w:tblGrid>
+        <w:gridCol w:w="1800"/>
+        <w:gridCol w:w="3600"/>
+        <w:gridCol w:w="1600"/>
+        <w:gridCol w:w="2000"/>
+      </w:tblGrid>
+      <w:tr>
+        <w:tc>
+          <w:tcPr>
+            <w:tcW w:w="1800" w:type="dxa"/>
+            <w:shd w:val="clear" w:color="auto" w:fill="F3F6FC"/>
+            <w:tcMar>
+              <w:top w:w="80" w:type="dxa"/>
+              <w:left w:w="120" w:type="dxa"/>
+              <w:bottom w:w="80" w:type="dxa"/>
+              <w:right w:w="120" w:type="dxa"/>
+            </w:tcMar>
+            <w:vAlign w:val="center"/>
+          </w:tcPr>
+          <w:p>
+            <w:r>
+              <w:rPr>
+                <w:b/>
+                <w:bCs/>
+                <w:color w:val="1E2761"/>
+              </w:rPr>
+              <w:t>Role</w:t>
+            </w:r>
+          </w:p>
+        </w:tc>
+        <w:tc>
+          <w:tcPr>
+            <w:tcW w:w="3600" w:type="dxa"/>
+            <w:shd w:val="clear" w:color="auto" w:fill="89B4FA"/>
+            <w:tcMar>
+              <w:top w:w="80" w:type="dxa"/>
+              <w:left w:w="120" w:type="dxa"/>
+              <w:bottom w:w="80" w:type="dxa"/>
+              <w:right w:w="120" w:type="dxa"/>
+            </w:tcMar>
+            <w:vAlign w:val="center"/>
+          </w:tcPr>
+          <w:p>
+            <w:r>
+              <w:rPr>
+                <w:color w:val="1E2761"/>
+              </w:rPr>
+              <w:t>Everyone</w:t>
+            </w:r>
+          </w:p>
+        </w:tc>
+        <w:tc>
+          <w:tcPr>
+            <w:tcW w:w="1600" w:type="dxa"/>
+            <w:shd w:val="clear" w:color="auto" w:fill="F3F6FC"/>
+            <w:tcMar>
+              <w:top w:w="80" w:type="dxa"/>
+              <w:left w:w="120" w:type="dxa"/>
+              <w:bottom w:w="80" w:type="dxa"/>
+              <w:right w:w="120" w:type="dxa"/>
+            </w:tcMar>
+            <w:vAlign w:val="center"/>
+          </w:tcPr>
+          <w:p>
+            <w:r>
+              <w:rPr>
+                <w:b/>
+                <w:bCs/>
+                <w:color w:val="1E2761"/>
+              </w:rPr>
+              <w:t>Date</w:t>
+            </w:r>
+          </w:p>
+        </w:tc>
+        <w:tc>
+          <w:tcPr>
+            <w:tcW w:w="2000" w:type="dxa"/>
+            <w:shd w:val="clear" w:color="auto" w:fill="FFFFFF"/>
+            <w:tcMar>
+              <w:top w:w="80" w:type="dxa"/>
+              <w:left w:w="120" w:type="dxa"/>
+              <w:bottom w:w="80" w:type="dxa"/>
+              <w:right w:w="120" w:type="dxa"/>
+            </w:tcMar>
+            <w:vAlign w:val="center"/>
+          </w:tcPr>
+          <w:p>
+            <w:r>
+              <w:rPr>
+                <w:color w:val="1E2761"/>
+              </w:rPr>
+              <w:t>Thursday</w:t>
+            </w:r>
+            <w:r>
+              <w:rPr>
+                <w:color w:val="1E2761"/>
+              </w:rPr>
+              <w:t xml:space="preserve">, </w:t>
+            </w:r>
+            <w:r>
+              <w:rPr>
+                <w:color w:val="1E2761"/>
+              </w:rPr>
+              <w:t>13</w:t>
+            </w:r>
+            <w:r>
+              <w:rPr>
+                <w:color w:val="1E2761"/>
+              </w:rPr>
+              <w:t xml:space="preserve"> August 2026</w:t>
+            </w:r>
+          </w:p>
+        </w:tc>
+      </w:tr>
+    </w:tbl>
+    <w:p>
+      <w:pPr>
+        <w:spacing w:before="160" w:after="40"/>
+      </w:pPr>
+      <w:r>
+        <w:rPr>
+          <w:b/>
+          <w:bCs/>
+          <w:color w:val="1E2761"/>
+        </w:rPr>
+        <w:t>Completion comment</w:t>
+      </w:r>
+    </w:p>
+    <w:p>
+      <w:pPr>
+        <w:rPr>
+          <w:color w:val="000000"/>
+          <w:lang w:val="en-ID"/>
+        </w:rPr>
+      </w:pPr>
+      <w:r>
+        <w:rPr>
+          <w:b/>
+          <w:bCs/>
+          <w:color w:val="000000"/>
+          <w:lang w:val="en-ID"/>
+        </w:rPr>
+        <w:t>Done</w:t>
+      </w:r>
+      <w:r>
+        <w:rPr>
+          <w:color w:val="000000"/>
+          <w:lang w:val="en-ID"/>
+        </w:rPr>
+        <w:t>: Introduction about each member to supervisor and get academic expectations.</w:t>
+      </w:r>
+    </w:p>
+    <w:p>
+      <w:pPr>
+        <w:rPr>
+          <w:color w:val="000000"/>
+          <w:lang w:val="en-ID"/>
+        </w:rPr>
+      </w:pPr>
+      <w:r>
+        <w:rPr>
+          <w:b/>
+          <w:bCs/>
+          <w:color w:val="000000"/>
+          <w:lang w:val="en-ID"/>
+        </w:rPr>
+        <w:t>Deliverable</w:t>
+      </w:r>
+      <w:r>
+        <w:rPr>
+          <w:color w:val="000000"/>
+          <w:lang w:val="en-ID"/>
+        </w:rPr>
+        <w:t>:</w:t>
+      </w:r>
+    </w:p>
+    <w:p>
+      <w:pPr>
+        <w:numPr>
+          <w:ilvl w:val="0"/>
+          <w:numId w:val="7"/>
+        </w:numPr>
+        <w:rPr>
+          <w:color w:val="000000"/>
+          <w:lang w:val="en-ID"/>
+        </w:rPr>
+      </w:pPr>
+      <w:r>
+        <w:rPr>
+          <w:color w:val="000000"/>
+          <w:lang w:val="en-ID"/>
+        </w:rPr>
+        <w:t xml:space="preserve">Meeting Minutes: </w:t>
+      </w:r>
+      <w:hyperlink r:id="rId23" w:history="1">
+        <w:r>
+          <w:rPr>
+            <w:rStyle w:val="Hyperlink"/>
+            <w:lang w:val="en-ID"/>
+          </w:rPr>
+          <w:t>2026-08-13_Supervisor Meeting Session.docx</w:t>
+        </w:r>
+      </w:hyperlink>
+    </w:p>
+    <w:p>
+      <w:pPr>
+        <w:rPr>
+          <w:color w:val="000000"/>
+          <w:lang w:val="en-ID"/>
+        </w:rPr>
+      </w:pPr>
+      <w:r>
+        <w:rPr>
+          <w:b/>
+          <w:bCs/>
+          <w:color w:val="000000"/>
+          <w:lang w:val="en-ID"/>
+        </w:rPr>
+        <w:t>Note for next role</w:t>
+      </w:r>
+      <w:r>
+        <w:rPr>
+          <w:color w:val="000000"/>
+          <w:lang w:val="en-ID"/>
+        </w:rPr>
+        <w:t>: None</w:t>
+      </w:r>
+    </w:p>
+    <w:p>
+      <w:pPr>
+        <w:rPr>
+          <w:color w:val="000000"/>
+        </w:rPr>
+      </w:pPr>
+    </w:p>
+    <w:p>
+      <w:pPr>
+        <w:pStyle w:val="Heading1"/>
+        <w:spacing w:before="320" w:after="140"/>
+      </w:pPr>
+      <w:r>
+        <w:t>[</w:t>
+      </w:r>
+      <w:r>
+        <w:t>PROJECT PROTOTYPING</w:t>
+      </w:r>
+      <w:r>
+        <w:t>] Task 1</w:t>
+      </w:r>
+      <w:r>
+        <w:t>3</w:t>
+      </w:r>
+      <w:r>
+        <w:t xml:space="preserve"> — </w:t>
+      </w:r>
+      <w:r>
+        <w:t>Project Proposal</w:t>
+      </w:r>
+    </w:p>
+    <w:tbl>
+      <w:tblPr>
+        <w:tblW w:w="9000" w:type="dxa"/>
+        <w:tblBorders>
+          <w:top w:val="single" w:sz="4" w:space="0" w:color="auto"/>
+          <w:left w:val="single" w:sz="4" w:space="0" w:color="auto"/>
+          <w:bottom w:val="single" w:sz="4" w:space="0" w:color="auto"/>
+          <w:right w:val="single" w:sz="4" w:space="0" w:color="auto"/>
+          <w:insideH w:val="single" w:sz="4" w:space="0" w:color="auto"/>
+          <w:insideV w:val="single" w:sz="4" w:space="0" w:color="auto"/>
+        </w:tblBorders>
+        <w:tblCellMar>
+          <w:left w:w="10" w:type="dxa"/>
+          <w:right w:w="10" w:type="dxa"/>
+        </w:tblCellMar>
+        <w:tblLook w:val="0000" w:firstRow="0" w:lastRow="0" w:firstColumn="0" w:lastColumn="0" w:noHBand="0" w:noVBand="0"/>
+      </w:tblPr>
+      <w:tblGrid>
+        <w:gridCol w:w="1800"/>
+        <w:gridCol w:w="3600"/>
+        <w:gridCol w:w="1600"/>
+        <w:gridCol w:w="2000"/>
+      </w:tblGrid>
+      <w:tr>
+        <w:tc>
+          <w:tcPr>
+            <w:tcW w:w="1800" w:type="dxa"/>
+            <w:shd w:val="clear" w:color="auto" w:fill="F3F6FC"/>
+            <w:tcMar>
+              <w:top w:w="80" w:type="dxa"/>
+              <w:left w:w="120" w:type="dxa"/>
+              <w:bottom w:w="80" w:type="dxa"/>
+              <w:right w:w="120" w:type="dxa"/>
+            </w:tcMar>
+            <w:vAlign w:val="center"/>
+          </w:tcPr>
+          <w:p>
+            <w:r>
+              <w:rPr>
+                <w:b/>
+                <w:bCs/>
+                <w:color w:val="1E2761"/>
+              </w:rPr>
+              <w:lastRenderedPageBreak/>
+              <w:t>Role</w:t>
+            </w:r>
+          </w:p>
+        </w:tc>
+        <w:tc>
+          <w:tcPr>
+            <w:tcW w:w="3600" w:type="dxa"/>
+            <w:shd w:val="clear" w:color="auto" w:fill="89B4FA"/>
+            <w:tcMar>
+              <w:top w:w="80" w:type="dxa"/>
+              <w:left w:w="120" w:type="dxa"/>
+              <w:bottom w:w="80" w:type="dxa"/>
+              <w:right w:w="120" w:type="dxa"/>
+            </w:tcMar>
+            <w:vAlign w:val="center"/>
+          </w:tcPr>
+          <w:p>
+            <w:r>
+              <w:t>PM – Khac Tung Lam Nguyen</w:t>
+            </w:r>
+          </w:p>
+          <w:p>
+            <w:r>
+              <w:t>BA – Hiep Vu</w:t>
+            </w:r>
+          </w:p>
+        </w:tc>
+        <w:tc>
+          <w:tcPr>
+            <w:tcW w:w="1600" w:type="dxa"/>
+            <w:shd w:val="clear" w:color="auto" w:fill="F3F6FC"/>
+            <w:tcMar>
+              <w:top w:w="80" w:type="dxa"/>
+              <w:left w:w="120" w:type="dxa"/>
+              <w:bottom w:w="80" w:type="dxa"/>
+              <w:right w:w="120" w:type="dxa"/>
+            </w:tcMar>
+            <w:vAlign w:val="center"/>
+          </w:tcPr>
+          <w:p>
+            <w:r>
+              <w:rPr>
+                <w:b/>
+                <w:bCs/>
+                <w:color w:val="1E2761"/>
+              </w:rPr>
+              <w:t>Date</w:t>
+            </w:r>
+          </w:p>
+        </w:tc>
+        <w:tc>
+          <w:tcPr>
+            <w:tcW w:w="2000" w:type="dxa"/>
+            <w:shd w:val="clear" w:color="auto" w:fill="FFFFFF"/>
+            <w:tcMar>
+              <w:top w:w="80" w:type="dxa"/>
+              <w:left w:w="120" w:type="dxa"/>
+              <w:bottom w:w="80" w:type="dxa"/>
+              <w:right w:w="120" w:type="dxa"/>
+            </w:tcMar>
+            <w:vAlign w:val="center"/>
+          </w:tcPr>
+          <w:p>
+            <w:r>
+              <w:rPr>
+                <w:color w:val="1E2761"/>
+              </w:rPr>
+              <w:t>Wednesday</w:t>
+            </w:r>
+            <w:r>
+              <w:rPr>
+                <w:color w:val="1E2761"/>
+              </w:rPr>
+              <w:t>, 1</w:t>
+            </w:r>
+            <w:r>
+              <w:rPr>
+                <w:color w:val="1E2761"/>
+              </w:rPr>
+              <w:t>2</w:t>
+            </w:r>
+            <w:r>
+              <w:rPr>
+                <w:color w:val="1E2761"/>
+              </w:rPr>
+              <w:t xml:space="preserve"> August 2026</w:t>
+            </w:r>
+          </w:p>
+        </w:tc>
+      </w:tr>
+    </w:tbl>
+    <w:p>
+      <w:pPr>
+        <w:spacing w:before="160" w:after="40"/>
+      </w:pPr>
+      <w:r>
+        <w:rPr>
+          <w:b/>
+          <w:bCs/>
+          <w:color w:val="1E2761"/>
+        </w:rPr>
+        <w:t>Completion comment</w:t>
+      </w:r>
+    </w:p>
+    <w:p>
+      <w:pPr>
+        <w:rPr>
+          <w:color w:val="000000"/>
+          <w:lang w:val="en-ID"/>
+        </w:rPr>
+      </w:pPr>
+      <w:r>
+        <w:rPr>
+          <w:b/>
+          <w:bCs/>
+          <w:color w:val="000000"/>
+          <w:lang w:val="en-ID"/>
+        </w:rPr>
+        <w:t>Done</w:t>
+      </w:r>
+      <w:r>
+        <w:rPr>
+          <w:color w:val="000000"/>
+          <w:lang w:val="en-ID"/>
+        </w:rPr>
+        <w:t xml:space="preserve">: </w:t>
+      </w:r>
+      <w:r>
+        <w:rPr>
+          <w:color w:val="000000"/>
+          <w:lang w:val="en-ID"/>
+        </w:rPr>
+        <w:t>We finished the Project Proposal document.</w:t>
+      </w:r>
+    </w:p>
+    <w:p>
+      <w:pPr>
+        <w:rPr>
+          <w:b/>
+          <w:bCs/>
+          <w:color w:val="000000"/>
+          <w:lang w:val="en-ID"/>
+        </w:rPr>
+      </w:pPr>
+      <w:r>
+        <w:rPr>
+          <w:b/>
+          <w:bCs/>
+          <w:color w:val="000000"/>
+          <w:lang w:val="en-ID"/>
+        </w:rPr>
+        <w:t>Deliverable</w:t>
+      </w:r>
+      <w:r>
+        <w:rPr>
+          <w:b/>
+          <w:bCs/>
+          <w:color w:val="000000"/>
+          <w:lang w:val="en-ID"/>
+        </w:rPr>
+        <w:t xml:space="preserve">: </w:t>
+      </w:r>
+      <w:r>
+        <w:rPr>
+          <w:color w:val="000000"/>
+          <w:lang w:val="en-ID"/>
+        </w:rPr>
+        <w:t xml:space="preserve">Document is updated at </w:t>
+      </w:r>
+      <w:hyperlink r:id="rId24" w:history="1">
+        <w:r>
+          <w:rPr>
+            <w:rStyle w:val="Hyperlink"/>
+            <w:lang w:val="en-ID"/>
+          </w:rPr>
+          <w:t>Client Proposal and Sprint 1 Plan.docx</w:t>
+        </w:r>
+      </w:hyperlink>
+    </w:p>
+    <w:p>
+      <w:pPr>
+        <w:rPr>
+          <w:color w:val="000000"/>
+          <w:lang w:val="en-ID"/>
+        </w:rPr>
+      </w:pPr>
+      <w:r>
+        <w:rPr>
+          <w:b/>
+          <w:bCs/>
+          <w:color w:val="000000"/>
+          <w:lang w:val="en-ID"/>
+        </w:rPr>
+        <w:t>Note</w:t>
+      </w:r>
+      <w:r>
+        <w:rPr>
+          <w:b/>
+          <w:bCs/>
+          <w:color w:val="000000"/>
+          <w:lang w:val="en-ID"/>
+        </w:rPr>
+        <w:t xml:space="preserve"> for next role: </w:t>
+      </w:r>
+      <w:r>
+        <w:rPr>
+          <w:color w:val="000000"/>
+          <w:lang w:val="en-ID"/>
+        </w:rPr>
+        <w:t>Complete the Sprint 1 Planning once the proposal is agreed and signed off.</w:t>
+      </w:r>
+    </w:p>
+    <w:p>
+      <w:pPr>
+        <w:rPr>
+          <w:color w:val="000000"/>
+        </w:rPr>
+      </w:pPr>
+    </w:p>
+    <w:p>
+      <w:pPr>
+        <w:pStyle w:val="Heading1"/>
+        <w:spacing w:before="320" w:after="140"/>
+      </w:pPr>
+      <w:r>
+        <w:t>[</w:t>
+      </w:r>
+      <w:r>
+        <w:t>PROJECT PROTOTYPING</w:t>
+      </w:r>
+      <w:r>
+        <w:t>] Task 1</w:t>
+      </w:r>
+      <w:r>
+        <w:t>4</w:t>
+      </w:r>
+      <w:r>
+        <w:t xml:space="preserve"> — </w:t>
+      </w:r>
+      <w:r>
+        <w:t>Sprint 1 Planning</w:t>
+      </w:r>
+    </w:p>
+    <w:tbl>
+      <w:tblPr>
+        <w:tblW w:w="9000" w:type="dxa"/>
+        <w:tblBorders>
+          <w:top w:val="single" w:sz="4" w:space="0" w:color="auto"/>
+          <w:left w:val="single" w:sz="4" w:space="0" w:color="auto"/>
+          <w:bottom w:val="single" w:sz="4" w:space="0" w:color="auto"/>
+          <w:right w:val="single" w:sz="4" w:space="0" w:color="auto"/>
+          <w:insideH w:val="single" w:sz="4" w:space="0" w:color="auto"/>
+          <w:insideV w:val="single" w:sz="4" w:space="0" w:color="auto"/>
+        </w:tblBorders>
+        <w:tblCellMar>
+          <w:left w:w="10" w:type="dxa"/>
+          <w:right w:w="10" w:type="dxa"/>
+        </w:tblCellMar>
+        <w:tblLook w:val="0000" w:firstRow="0" w:lastRow="0" w:firstColumn="0" w:lastColumn="0" w:noHBand="0" w:noVBand="0"/>
+      </w:tblPr>
+      <w:tblGrid>
+        <w:gridCol w:w="1800"/>
+        <w:gridCol w:w="3600"/>
+        <w:gridCol w:w="1600"/>
+        <w:gridCol w:w="2000"/>
+      </w:tblGrid>
+      <w:tr>
+        <w:tc>
+          <w:tcPr>
+            <w:tcW w:w="1800" w:type="dxa"/>
+            <w:shd w:val="clear" w:color="auto" w:fill="F3F6FC"/>
+            <w:tcMar>
+              <w:top w:w="80" w:type="dxa"/>
+              <w:left w:w="120" w:type="dxa"/>
+              <w:bottom w:w="80" w:type="dxa"/>
+              <w:right w:w="120" w:type="dxa"/>
+            </w:tcMar>
+            <w:vAlign w:val="center"/>
+          </w:tcPr>
+          <w:p>
+            <w:r>
+              <w:rPr>
+                <w:b/>
+                <w:bCs/>
+                <w:color w:val="1E2761"/>
+              </w:rPr>
+              <w:t>Role</w:t>
+            </w:r>
+          </w:p>
+        </w:tc>
+        <w:tc>
+          <w:tcPr>
+            <w:tcW w:w="3600" w:type="dxa"/>
+            <w:shd w:val="clear" w:color="auto" w:fill="89B4FA"/>
+            <w:tcMar>
+              <w:top w:w="80" w:type="dxa"/>
+              <w:left w:w="120" w:type="dxa"/>
+              <w:bottom w:w="80" w:type="dxa"/>
+              <w:right w:w="120" w:type="dxa"/>
+            </w:tcMar>
+            <w:vAlign w:val="center"/>
+          </w:tcPr>
+          <w:p>
+            <w:r>
+              <w:t>PM – Khac Tung Lam Nguyen</w:t>
+            </w:r>
+          </w:p>
+          <w:p>
+            <w:r>
+              <w:t>BA – Hiep Vu</w:t>
+            </w:r>
+          </w:p>
+        </w:tc>
+        <w:tc>
+          <w:tcPr>
+            <w:tcW w:w="1600" w:type="dxa"/>
+            <w:shd w:val="clear" w:color="auto" w:fill="F3F6FC"/>
+            <w:tcMar>
+              <w:top w:w="80" w:type="dxa"/>
+              <w:left w:w="120" w:type="dxa"/>
+              <w:bottom w:w="80" w:type="dxa"/>
+              <w:right w:w="120" w:type="dxa"/>
+            </w:tcMar>
+            <w:vAlign w:val="center"/>
+          </w:tcPr>
+          <w:p>
+            <w:r>
+              <w:rPr>
+                <w:b/>
+                <w:bCs/>
+                <w:color w:val="1E2761"/>
+              </w:rPr>
+              <w:t>Date</w:t>
+            </w:r>
+          </w:p>
+        </w:tc>
+        <w:tc>
+          <w:tcPr>
+            <w:tcW w:w="2000" w:type="dxa"/>
+            <w:shd w:val="clear" w:color="auto" w:fill="FFFFFF"/>
+            <w:tcMar>
+              <w:top w:w="80" w:type="dxa"/>
+              <w:left w:w="120" w:type="dxa"/>
+              <w:bottom w:w="80" w:type="dxa"/>
+              <w:right w:w="120" w:type="dxa"/>
+            </w:tcMar>
+            <w:vAlign w:val="center"/>
+          </w:tcPr>
+          <w:p>
+            <w:r>
+              <w:rPr>
+                <w:color w:val="1E2761"/>
+              </w:rPr>
+              <w:t>Friday</w:t>
+            </w:r>
+            <w:r>
+              <w:rPr>
+                <w:color w:val="1E2761"/>
+              </w:rPr>
+              <w:t>, 1</w:t>
+            </w:r>
+            <w:r>
+              <w:rPr>
+                <w:color w:val="1E2761"/>
+              </w:rPr>
+              <w:t>4</w:t>
+            </w:r>
+            <w:r>
+              <w:rPr>
+                <w:color w:val="1E2761"/>
+              </w:rPr>
+              <w:t xml:space="preserve"> August 2026</w:t>
+            </w:r>
+          </w:p>
+        </w:tc>
+      </w:tr>
+    </w:tbl>
+    <w:p>
+      <w:pPr>
+        <w:spacing w:before="160" w:after="40"/>
+      </w:pPr>
+      <w:r>
+        <w:rPr>
+          <w:b/>
+          <w:bCs/>
+          <w:color w:val="1E2761"/>
+        </w:rPr>
+        <w:t>Completion comment</w:t>
+      </w:r>
+    </w:p>
+    <w:p>
+      <w:pPr>
+        <w:rPr>
+          <w:color w:val="000000"/>
+          <w:lang w:val="en-ID"/>
+        </w:rPr>
+      </w:pPr>
+      <w:r>
+        <w:rPr>
+          <w:b/>
+          <w:bCs/>
+          <w:color w:val="000000"/>
+          <w:lang w:val="en-ID"/>
+        </w:rPr>
+        <w:t>Done</w:t>
+      </w:r>
+      <w:r>
+        <w:rPr>
+          <w:color w:val="000000"/>
+          <w:lang w:val="en-ID"/>
+        </w:rPr>
+        <w:t>:</w:t>
+      </w:r>
+    </w:p>
+    <w:p>
+      <w:pPr>
+        <w:rPr>
+          <w:b/>
+          <w:bCs/>
+          <w:color w:val="000000"/>
+          <w:lang w:val="en-ID"/>
+        </w:rPr>
+      </w:pPr>
+      <w:r>
+        <w:rPr>
+          <w:b/>
+          <w:bCs/>
+          <w:color w:val="000000"/>
+          <w:lang w:val="en-ID"/>
+        </w:rPr>
+        <w:t>Deliverable</w:t>
+      </w:r>
+      <w:r>
+        <w:rPr>
+          <w:b/>
+          <w:bCs/>
+          <w:color w:val="000000"/>
+          <w:lang w:val="en-ID"/>
+        </w:rPr>
+        <w:t xml:space="preserve">: </w:t>
+      </w:r>
+    </w:p>
+    <w:p>
+      <w:pPr>
+        <w:rPr>
+          <w:color w:val="000000"/>
+          <w:lang w:val="en-ID"/>
+        </w:rPr>
+      </w:pPr>
+      <w:r>
+        <w:rPr>
+          <w:b/>
+          <w:bCs/>
+          <w:color w:val="000000"/>
+          <w:lang w:val="en-ID"/>
+        </w:rPr>
+        <w:t>Note</w:t>
+      </w:r>
+      <w:r>
+        <w:rPr>
+          <w:b/>
+          <w:bCs/>
+          <w:color w:val="000000"/>
+          <w:lang w:val="en-ID"/>
+        </w:rPr>
+        <w:t xml:space="preserve"> for next role: </w:t>
+      </w:r>
+    </w:p>
+    <w:p>
+      <w:pPr>
+        <w:rPr>
+          <w:color w:val="000000"/>
+        </w:rPr>
       </w:pPr>
     </w:p>
     <w:sectPr>
-      <w:headerReference w:type="default" r:id="rId12"/>
+      <w:headerReference w:type="default" r:id="rId25"/>
       <w:pgSz w:w="12240" w:h="15840"/>
       <w:pgMar w:top="1440" w:right="1440" w:bottom="1440" w:left="1440" w:header="708" w:footer="708" w:gutter="0"/>
       <w:cols w:space="720"/>
@@ -2087,7 +3861,7 @@
 </file>
 
 <file path=word/endnotes.xml><?xml version="1.0" encoding="utf-8"?>
-<w:endnotes xmlns:wpc="http://schemas.microsoft.com/office/word/2010/wordprocessingCanvas" xmlns:cx="http://schemas.microsoft.com/office/drawing/2014/chartex" xmlns:cx1="http://schemas.microsoft.com/office/drawing/2015/9/8/chartex" xmlns:cx2="http://schemas.microsoft.com/office/drawing/2015/10/21/chartex" xmlns:cx3="http://schemas.microsoft.com/office/drawing/2016/5/9/chartex" xmlns:cx4="http://schemas.microsoft.com/office/drawing/2016/5/10/chartex" xmlns:cx5="http://schemas.microsoft.com/office/drawing/2016/5/11/chartex" xmlns:cx6="http://schemas.microsoft.com/office/drawing/2016/5/12/chartex" xmlns:cx7="http://schemas.microsoft.com/office/drawing/2016/5/13/chartex" xmlns:cx8="http://schemas.microsoft.com/office/drawing/2016/5/14/chartex" xmlns:mc="http://schemas.openxmlformats.org/markup-compatibility/2006" xmlns:m="http://schemas.openxmlformats.org/officeDocument/2006/math" xmlns:aink="http://schemas.microsoft.com/office/drawing/2016/ink" xmlns:am3d="http://schemas.microsoft.com/office/drawing/2017/model3d" xmlns:oel="http://schemas.microsoft.com/office/2019/extlst" xmlns:r="http://schemas.openxmlformats.org/officeDocument/2006/relationships" xmlns:wp14="http://schemas.microsoft.com/office/word/2010/wordprocessingDrawing" xmlns:wp="http://schemas.openxmlformats.org/drawingml/2006/wordprocessingDrawing" xmlns:wpg="http://schemas.microsoft.com/office/word/2010/wordprocessingGroup" xmlns:wpi="http://schemas.microsoft.com/office/word/2010/wordprocessingInk" xmlns:wps="http://schemas.microsoft.com/office/word/2010/wordprocessingShape" xmlns:o="urn:schemas-microsoft-com:office:office" xmlns:v="urn:schemas-microsoft-com:vml" xmlns:w10="urn:schemas-microsoft-com:office:word" xmlns:w="http://schemas.openxmlformats.org/wordprocessingml/2006/main" xmlns:w14="http://schemas.microsoft.com/office/word/2010/wordml" xmlns:w15="http://schemas.microsoft.com/office/word/2012/wordml" xmlns:w16cei="http://schemas.microsoft.com/office/word/2026/wordml/cei" xmlns:w16cex="http://schemas.microsoft.com/office/word/2018/wordml/cex" xmlns:w16cid="http://schemas.microsoft.com/office/word/2016/wordml/cid" xmlns:w16="http://schemas.microsoft.com/office/word/2018/wordml" xmlns:w16sdtdh="http://schemas.microsoft.com/office/word/2020/wordml/sdtdatahash" xmlns:w16sdtfl="http://schemas.microsoft.com/office/word/2024/wordml/sdtformatlock" xmlns:w16se="http://schemas.microsoft.com/office/word/2015/wordml/symex" xmlns:w16du="http://schemas.microsoft.com/office/word/2023/wordml/word16du" xmlns:wne="http://schemas.microsoft.com/office/word/2006/wordml" mc:Ignorable="w14 w15 w16se w16cid w16 w16cex w16sdtdh w16sdtfl w16du wp14">
+<w:endnotes xmlns:wpc="http://schemas.microsoft.com/office/word/2010/wordprocessingCanvas" xmlns:cx="http://schemas.microsoft.com/office/drawing/2014/chartex" xmlns:cx1="http://schemas.microsoft.com/office/drawing/2015/9/8/chartex" xmlns:cx2="http://schemas.microsoft.com/office/drawing/2015/10/21/chartex" xmlns:cx3="http://schemas.microsoft.com/office/drawing/2016/5/9/chartex" xmlns:cx4="http://schemas.microsoft.com/office/drawing/2016/5/10/chartex" xmlns:cx5="http://schemas.microsoft.com/office/drawing/2016/5/11/chartex" xmlns:cx6="http://schemas.microsoft.com/office/drawing/2016/5/12/chartex" xmlns:cx7="http://schemas.microsoft.com/office/drawing/2016/5/13/chartex" xmlns:cx8="http://schemas.microsoft.com/office/drawing/2016/5/14/chartex" xmlns:mc="http://schemas.openxmlformats.org/markup-compatibility/2006" xmlns:aink="http://schemas.microsoft.com/office/drawing/2016/ink" xmlns:am3d="http://schemas.microsoft.com/office/drawing/2017/model3d" xmlns:o="urn:schemas-microsoft-com:office:office" xmlns:oel="http://schemas.microsoft.com/office/2019/extlst" xmlns:r="http://schemas.openxmlformats.org/officeDocument/2006/relationships" xmlns:m="http://schemas.openxmlformats.org/officeDocument/2006/math" xmlns:v="urn:schemas-microsoft-com:vml" xmlns:wp14="http://schemas.microsoft.com/office/word/2010/wordprocessingDrawing" xmlns:wp="http://schemas.openxmlformats.org/drawingml/2006/wordprocessingDrawing" xmlns:w10="urn:schemas-microsoft-com:office:word" xmlns:w="http://schemas.openxmlformats.org/wordprocessingml/2006/main" xmlns:w14="http://schemas.microsoft.com/office/word/2010/wordml" xmlns:w15="http://schemas.microsoft.com/office/word/2012/wordml" xmlns:w16cei="http://schemas.microsoft.com/office/word/2026/wordml/cei" xmlns:w16cex="http://schemas.microsoft.com/office/word/2018/wordml/cex" xmlns:w16cid="http://schemas.microsoft.com/office/word/2016/wordml/cid" xmlns:w16="http://schemas.microsoft.com/office/word/2018/wordml" xmlns:w16du="http://schemas.microsoft.com/office/word/2023/wordml/word16du" xmlns:w16sdtdh="http://schemas.microsoft.com/office/word/2020/wordml/sdtdatahash" xmlns:w16sdtfl="http://schemas.microsoft.com/office/word/2024/wordml/sdtformatlock" xmlns:w16se="http://schemas.microsoft.com/office/word/2015/wordml/symex" xmlns:wpg="http://schemas.microsoft.com/office/word/2010/wordprocessingGroup" xmlns:wpi="http://schemas.microsoft.com/office/word/2010/wordprocessingInk" xmlns:wne="http://schemas.microsoft.com/office/word/2006/wordml" xmlns:wps="http://schemas.microsoft.com/office/word/2010/wordprocessingShape" mc:Ignorable="w14 w15 w16se w16cid w16 w16cex w16sdtdh w16sdtfl w16du wp14">
   <w:endnote w:type="separator" w:id="-1">
     <w:p>
       <w:r>
@@ -2106,7 +3880,7 @@
 </file>
 
 <file path=word/footnotes.xml><?xml version="1.0" encoding="utf-8"?>
-<w:footnotes xmlns:wpc="http://schemas.microsoft.com/office/word/2010/wordprocessingCanvas" xmlns:cx="http://schemas.microsoft.com/office/drawing/2014/chartex" xmlns:cx1="http://schemas.microsoft.com/office/drawing/2015/9/8/chartex" xmlns:cx2="http://schemas.microsoft.com/office/drawing/2015/10/21/chartex" xmlns:cx3="http://schemas.microsoft.com/office/drawing/2016/5/9/chartex" xmlns:cx4="http://schemas.microsoft.com/office/drawing/2016/5/10/chartex" xmlns:cx5="http://schemas.microsoft.com/office/drawing/2016/5/11/chartex" xmlns:cx6="http://schemas.microsoft.com/office/drawing/2016/5/12/chartex" xmlns:cx7="http://schemas.microsoft.com/office/drawing/2016/5/13/chartex" xmlns:cx8="http://schemas.microsoft.com/office/drawing/2016/5/14/chartex" xmlns:mc="http://schemas.openxmlformats.org/markup-compatibility/2006" xmlns:m="http://schemas.openxmlformats.org/officeDocument/2006/math" xmlns:aink="http://schemas.microsoft.com/office/drawing/2016/ink" xmlns:am3d="http://schemas.microsoft.com/office/drawing/2017/model3d" xmlns:oel="http://schemas.microsoft.com/office/2019/extlst" xmlns:r="http://schemas.openxmlformats.org/officeDocument/2006/relationships" xmlns:wp14="http://schemas.microsoft.com/office/word/2010/wordprocessingDrawing" xmlns:wp="http://schemas.openxmlformats.org/drawingml/2006/wordprocessingDrawing" xmlns:wpg="http://schemas.microsoft.com/office/word/2010/wordprocessingGroup" xmlns:wpi="http://schemas.microsoft.com/office/word/2010/wordprocessingInk" xmlns:wps="http://schemas.microsoft.com/office/word/2010/wordprocessingShape" xmlns:o="urn:schemas-microsoft-com:office:office" xmlns:v="urn:schemas-microsoft-com:vml" xmlns:w10="urn:schemas-microsoft-com:office:word" xmlns:w="http://schemas.openxmlformats.org/wordprocessingml/2006/main" xmlns:w14="http://schemas.microsoft.com/office/word/2010/wordml" xmlns:w15="http://schemas.microsoft.com/office/word/2012/wordml" xmlns:w16cei="http://schemas.microsoft.com/office/word/2026/wordml/cei" xmlns:w16cex="http://schemas.microsoft.com/office/word/2018/wordml/cex" xmlns:w16cid="http://schemas.microsoft.com/office/word/2016/wordml/cid" xmlns:w16="http://schemas.microsoft.com/office/word/2018/wordml" xmlns:w16sdtdh="http://schemas.microsoft.com/office/word/2020/wordml/sdtdatahash" xmlns:w16sdtfl="http://schemas.microsoft.com/office/word/2024/wordml/sdtformatlock" xmlns:w16se="http://schemas.microsoft.com/office/word/2015/wordml/symex" xmlns:w16du="http://schemas.microsoft.com/office/word/2023/wordml/word16du" xmlns:wne="http://schemas.microsoft.com/office/word/2006/wordml" mc:Ignorable="w14 w15 w16se w16cid w16 w16cex w16sdtdh w16sdtfl w16du wp14">
+<w:footnotes xmlns:wpc="http://schemas.microsoft.com/office/word/2010/wordprocessingCanvas" xmlns:cx="http://schemas.microsoft.com/office/drawing/2014/chartex" xmlns:cx1="http://schemas.microsoft.com/office/drawing/2015/9/8/chartex" xmlns:cx2="http://schemas.microsoft.com/office/drawing/2015/10/21/chartex" xmlns:cx3="http://schemas.microsoft.com/office/drawing/2016/5/9/chartex" xmlns:cx4="http://schemas.microsoft.com/office/drawing/2016/5/10/chartex" xmlns:cx5="http://schemas.microsoft.com/office/drawing/2016/5/11/chartex" xmlns:cx6="http://schemas.microsoft.com/office/drawing/2016/5/12/chartex" xmlns:cx7="http://schemas.microsoft.com/office/drawing/2016/5/13/chartex" xmlns:cx8="http://schemas.microsoft.com/office/drawing/2016/5/14/chartex" xmlns:mc="http://schemas.openxmlformats.org/markup-compatibility/2006" xmlns:aink="http://schemas.microsoft.com/office/drawing/2016/ink" xmlns:am3d="http://schemas.microsoft.com/office/drawing/2017/model3d" xmlns:o="urn:schemas-microsoft-com:office:office" xmlns:oel="http://schemas.microsoft.com/office/2019/extlst" xmlns:r="http://schemas.openxmlformats.org/officeDocument/2006/relationships" xmlns:m="http://schemas.openxmlformats.org/officeDocument/2006/math" xmlns:v="urn:schemas-microsoft-com:vml" xmlns:wp14="http://schemas.microsoft.com/office/word/2010/wordprocessingDrawing" xmlns:wp="http://schemas.openxmlformats.org/drawingml/2006/wordprocessingDrawing" xmlns:w10="urn:schemas-microsoft-com:office:word" xmlns:w="http://schemas.openxmlformats.org/wordprocessingml/2006/main" xmlns:w14="http://schemas.microsoft.com/office/word/2010/wordml" xmlns:w15="http://schemas.microsoft.com/office/word/2012/wordml" xmlns:w16cei="http://schemas.microsoft.com/office/word/2026/wordml/cei" xmlns:w16cex="http://schemas.microsoft.com/office/word/2018/wordml/cex" xmlns:w16cid="http://schemas.microsoft.com/office/word/2016/wordml/cid" xmlns:w16="http://schemas.microsoft.com/office/word/2018/wordml" xmlns:w16du="http://schemas.microsoft.com/office/word/2023/wordml/word16du" xmlns:w16sdtdh="http://schemas.microsoft.com/office/word/2020/wordml/sdtdatahash" xmlns:w16sdtfl="http://schemas.microsoft.com/office/word/2024/wordml/sdtformatlock" xmlns:w16se="http://schemas.microsoft.com/office/word/2015/wordml/symex" xmlns:wpg="http://schemas.microsoft.com/office/word/2010/wordprocessingGroup" xmlns:wpi="http://schemas.microsoft.com/office/word/2010/wordprocessingInk" xmlns:wne="http://schemas.microsoft.com/office/word/2006/wordml" xmlns:wps="http://schemas.microsoft.com/office/word/2010/wordprocessingShape" mc:Ignorable="w14 w15 w16se w16cid w16 w16cex w16sdtdh w16sdtfl w16du wp14">
   <w:footnote w:type="separator" w:id="-1">
     <w:p>
       <w:r>
@@ -2125,7 +3899,7 @@
 </file>
 
 <file path=word/header1.xml><?xml version="1.0" encoding="utf-8"?>
-<w:hdr xmlns:wpc="http://schemas.microsoft.com/office/word/2010/wordprocessingCanvas" xmlns:cx="http://schemas.microsoft.com/office/drawing/2014/chartex" xmlns:cx1="http://schemas.microsoft.com/office/drawing/2015/9/8/chartex" xmlns:cx2="http://schemas.microsoft.com/office/drawing/2015/10/21/chartex" xmlns:cx3="http://schemas.microsoft.com/office/drawing/2016/5/9/chartex" xmlns:cx4="http://schemas.microsoft.com/office/drawing/2016/5/10/chartex" xmlns:cx5="http://schemas.microsoft.com/office/drawing/2016/5/11/chartex" xmlns:cx6="http://schemas.microsoft.com/office/drawing/2016/5/12/chartex" xmlns:cx7="http://schemas.microsoft.com/office/drawing/2016/5/13/chartex" xmlns:cx8="http://schemas.microsoft.com/office/drawing/2016/5/14/chartex" xmlns:mc="http://schemas.openxmlformats.org/markup-compatibility/2006" xmlns:m="http://schemas.openxmlformats.org/officeDocument/2006/math" xmlns:aink="http://schemas.microsoft.com/office/drawing/2016/ink" xmlns:am3d="http://schemas.microsoft.com/office/drawing/2017/model3d" xmlns:oel="http://schemas.microsoft.com/office/2019/extlst" xmlns:r="http://schemas.openxmlformats.org/officeDocument/2006/relationships" xmlns:wp14="http://schemas.microsoft.com/office/word/2010/wordprocessingDrawing" xmlns:wp="http://schemas.openxmlformats.org/drawingml/2006/wordprocessingDrawing" xmlns:wpg="http://schemas.microsoft.com/office/word/2010/wordprocessingGroup" xmlns:wpi="http://schemas.microsoft.com/office/word/2010/wordprocessingInk" xmlns:wps="http://schemas.microsoft.com/office/word/2010/wordprocessingShape" xmlns:o="urn:schemas-microsoft-com:office:office" xmlns:v="urn:schemas-microsoft-com:vml" xmlns:w10="urn:schemas-microsoft-com:office:word" xmlns:w="http://schemas.openxmlformats.org/wordprocessingml/2006/main" xmlns:w14="http://schemas.microsoft.com/office/word/2010/wordml" xmlns:w15="http://schemas.microsoft.com/office/word/2012/wordml" xmlns:w16cei="http://schemas.microsoft.com/office/word/2026/wordml/cei" xmlns:w16cex="http://schemas.microsoft.com/office/word/2018/wordml/cex" xmlns:w16cid="http://schemas.microsoft.com/office/word/2016/wordml/cid" xmlns:w16="http://schemas.microsoft.com/office/word/2018/wordml" xmlns:w16sdtdh="http://schemas.microsoft.com/office/word/2020/wordml/sdtdatahash" xmlns:w16sdtfl="http://schemas.microsoft.com/office/word/2024/wordml/sdtformatlock" xmlns:w16se="http://schemas.microsoft.com/office/word/2015/wordml/symex" xmlns:w16du="http://schemas.microsoft.com/office/word/2023/wordml/word16du" xmlns:wne="http://schemas.microsoft.com/office/word/2006/wordml" mc:Ignorable="w14 w15 w16se w16cid w16 w16cex w16sdtdh w16sdtfl w16du wp14">
+<w:hdr xmlns:wpc="http://schemas.microsoft.com/office/word/2010/wordprocessingCanvas" xmlns:cx="http://schemas.microsoft.com/office/drawing/2014/chartex" xmlns:cx1="http://schemas.microsoft.com/office/drawing/2015/9/8/chartex" xmlns:cx2="http://schemas.microsoft.com/office/drawing/2015/10/21/chartex" xmlns:cx3="http://schemas.microsoft.com/office/drawing/2016/5/9/chartex" xmlns:cx4="http://schemas.microsoft.com/office/drawing/2016/5/10/chartex" xmlns:cx5="http://schemas.microsoft.com/office/drawing/2016/5/11/chartex" xmlns:cx6="http://schemas.microsoft.com/office/drawing/2016/5/12/chartex" xmlns:cx7="http://schemas.microsoft.com/office/drawing/2016/5/13/chartex" xmlns:cx8="http://schemas.microsoft.com/office/drawing/2016/5/14/chartex" xmlns:mc="http://schemas.openxmlformats.org/markup-compatibility/2006" xmlns:aink="http://schemas.microsoft.com/office/drawing/2016/ink" xmlns:am3d="http://schemas.microsoft.com/office/drawing/2017/model3d" xmlns:o="urn:schemas-microsoft-com:office:office" xmlns:oel="http://schemas.microsoft.com/office/2019/extlst" xmlns:r="http://schemas.openxmlformats.org/officeDocument/2006/relationships" xmlns:m="http://schemas.openxmlformats.org/officeDocument/2006/math" xmlns:v="urn:schemas-microsoft-com:vml" xmlns:wp14="http://schemas.microsoft.com/office/word/2010/wordprocessingDrawing" xmlns:wp="http://schemas.openxmlformats.org/drawingml/2006/wordprocessingDrawing" xmlns:w10="urn:schemas-microsoft-com:office:word" xmlns:w="http://schemas.openxmlformats.org/wordprocessingml/2006/main" xmlns:w14="http://schemas.microsoft.com/office/word/2010/wordml" xmlns:w15="http://schemas.microsoft.com/office/word/2012/wordml" xmlns:w16cei="http://schemas.microsoft.com/office/word/2026/wordml/cei" xmlns:w16cex="http://schemas.microsoft.com/office/word/2018/wordml/cex" xmlns:w16cid="http://schemas.microsoft.com/office/word/2016/wordml/cid" xmlns:w16="http://schemas.microsoft.com/office/word/2018/wordml" xmlns:w16du="http://schemas.microsoft.com/office/word/2023/wordml/word16du" xmlns:w16sdtdh="http://schemas.microsoft.com/office/word/2020/wordml/sdtdatahash" xmlns:w16sdtfl="http://schemas.microsoft.com/office/word/2024/wordml/sdtformatlock" xmlns:w16se="http://schemas.microsoft.com/office/word/2015/wordml/symex" xmlns:wpg="http://schemas.microsoft.com/office/word/2010/wordprocessingGroup" xmlns:wpi="http://schemas.microsoft.com/office/word/2010/wordprocessingInk" xmlns:wne="http://schemas.microsoft.com/office/word/2006/wordml" xmlns:wps="http://schemas.microsoft.com/office/word/2010/wordprocessingShape" mc:Ignorable="w14 w15 w16se w16cid w16 w16cex w16sdtdh w16sdtfl w16du wp14">
   <w:p>
     <w:pPr>
       <w:pStyle w:val="Header"/>
@@ -2189,7 +3963,7 @@
 </file>
 
 <file path=word/numbering.xml><?xml version="1.0" encoding="utf-8"?>
-<w:numbering xmlns:wpc="http://schemas.microsoft.com/office/word/2010/wordprocessingCanvas" xmlns:cx="http://schemas.microsoft.com/office/drawing/2014/chartex" xmlns:cx1="http://schemas.microsoft.com/office/drawing/2015/9/8/chartex" xmlns:cx2="http://schemas.microsoft.com/office/drawing/2015/10/21/chartex" xmlns:cx3="http://schemas.microsoft.com/office/drawing/2016/5/9/chartex" xmlns:cx4="http://schemas.microsoft.com/office/drawing/2016/5/10/chartex" xmlns:cx5="http://schemas.microsoft.com/office/drawing/2016/5/11/chartex" xmlns:cx6="http://schemas.microsoft.com/office/drawing/2016/5/12/chartex" xmlns:cx7="http://schemas.microsoft.com/office/drawing/2016/5/13/chartex" xmlns:cx8="http://schemas.microsoft.com/office/drawing/2016/5/14/chartex" xmlns:mc="http://schemas.openxmlformats.org/markup-compatibility/2006" xmlns:m="http://schemas.openxmlformats.org/officeDocument/2006/math" xmlns:aink="http://schemas.microsoft.com/office/drawing/2016/ink" xmlns:am3d="http://schemas.microsoft.com/office/drawing/2017/model3d" xmlns:oel="http://schemas.microsoft.com/office/2019/extlst" xmlns:r="http://schemas.openxmlformats.org/officeDocument/2006/relationships" xmlns:wp14="http://schemas.microsoft.com/office/word/2010/wordprocessingDrawing" xmlns:wp="http://schemas.openxmlformats.org/drawingml/2006/wordprocessingDrawing" xmlns:wpg="http://schemas.microsoft.com/office/word/2010/wordprocessingGroup" xmlns:wpi="http://schemas.microsoft.com/office/word/2010/wordprocessingInk" xmlns:wps="http://schemas.microsoft.com/office/word/2010/wordprocessingShape" xmlns:o="urn:schemas-microsoft-com:office:office" xmlns:v="urn:schemas-microsoft-com:vml" xmlns:w10="urn:schemas-microsoft-com:office:word" xmlns:w="http://schemas.openxmlformats.org/wordprocessingml/2006/main" xmlns:w14="http://schemas.microsoft.com/office/word/2010/wordml" xmlns:w15="http://schemas.microsoft.com/office/word/2012/wordml" xmlns:w16cei="http://schemas.microsoft.com/office/word/2026/wordml/cei" xmlns:w16cex="http://schemas.microsoft.com/office/word/2018/wordml/cex" xmlns:w16cid="http://schemas.microsoft.com/office/word/2016/wordml/cid" xmlns:w16="http://schemas.microsoft.com/office/word/2018/wordml" xmlns:w16sdtdh="http://schemas.microsoft.com/office/word/2020/wordml/sdtdatahash" xmlns:w16sdtfl="http://schemas.microsoft.com/office/word/2024/wordml/sdtformatlock" xmlns:w16se="http://schemas.microsoft.com/office/word/2015/wordml/symex" xmlns:w16du="http://schemas.microsoft.com/office/word/2023/wordml/word16du" xmlns:wne="http://schemas.microsoft.com/office/word/2006/wordml" mc:Ignorable="w14 w15 w16se w16cid w16 w16cex w16sdtdh w16sdtfl w16du wp14">
+<w:numbering xmlns:wpc="http://schemas.microsoft.com/office/word/2010/wordprocessingCanvas" xmlns:cx="http://schemas.microsoft.com/office/drawing/2014/chartex" xmlns:cx1="http://schemas.microsoft.com/office/drawing/2015/9/8/chartex" xmlns:cx2="http://schemas.microsoft.com/office/drawing/2015/10/21/chartex" xmlns:cx3="http://schemas.microsoft.com/office/drawing/2016/5/9/chartex" xmlns:cx4="http://schemas.microsoft.com/office/drawing/2016/5/10/chartex" xmlns:cx5="http://schemas.microsoft.com/office/drawing/2016/5/11/chartex" xmlns:cx6="http://schemas.microsoft.com/office/drawing/2016/5/12/chartex" xmlns:cx7="http://schemas.microsoft.com/office/drawing/2016/5/13/chartex" xmlns:cx8="http://schemas.microsoft.com/office/drawing/2016/5/14/chartex" xmlns:mc="http://schemas.openxmlformats.org/markup-compatibility/2006" xmlns:aink="http://schemas.microsoft.com/office/drawing/2016/ink" xmlns:am3d="http://schemas.microsoft.com/office/drawing/2017/model3d" xmlns:o="urn:schemas-microsoft-com:office:office" xmlns:oel="http://schemas.microsoft.com/office/2019/extlst" xmlns:r="http://schemas.openxmlformats.org/officeDocument/2006/relationships" xmlns:m="http://schemas.openxmlformats.org/officeDocument/2006/math" xmlns:v="urn:schemas-microsoft-com:vml" xmlns:wp14="http://schemas.microsoft.com/office/word/2010/wordprocessingDrawing" xmlns:wp="http://schemas.openxmlformats.org/drawingml/2006/wordprocessingDrawing" xmlns:w10="urn:schemas-microsoft-com:office:word" xmlns:w="http://schemas.openxmlformats.org/wordprocessingml/2006/main" xmlns:w14="http://schemas.microsoft.com/office/word/2010/wordml" xmlns:w15="http://schemas.microsoft.com/office/word/2012/wordml" xmlns:w16cei="http://schemas.microsoft.com/office/word/2026/wordml/cei" xmlns:w16cex="http://schemas.microsoft.com/office/word/2018/wordml/cex" xmlns:w16cid="http://schemas.microsoft.com/office/word/2016/wordml/cid" xmlns:w16="http://schemas.microsoft.com/office/word/2018/wordml" xmlns:w16du="http://schemas.microsoft.com/office/word/2023/wordml/word16du" xmlns:w16sdtdh="http://schemas.microsoft.com/office/word/2020/wordml/sdtdatahash" xmlns:w16sdtfl="http://schemas.microsoft.com/office/word/2024/wordml/sdtformatlock" xmlns:w16se="http://schemas.microsoft.com/office/word/2015/wordml/symex" xmlns:wpg="http://schemas.microsoft.com/office/word/2010/wordprocessingGroup" xmlns:wpi="http://schemas.microsoft.com/office/word/2010/wordprocessingInk" xmlns:wne="http://schemas.microsoft.com/office/word/2006/wordml" xmlns:wps="http://schemas.microsoft.com/office/word/2010/wordprocessingShape" mc:Ignorable="w14 w15 w16se w16cid w16 w16cex w16sdtdh w16sdtfl w16du wp14">
   <w:abstractNum w:abstractNumId="0" w15:restartNumberingAfterBreak="0">
     <w:nsid w:val="050B24B6"/>
     <w:multiLevelType w:val="hybridMultilevel"/>
@@ -2276,17 +4050,785 @@
       </w:pPr>
     </w:lvl>
   </w:abstractNum>
-  <w:num w:numId="1" w16cid:durableId="1560434364">
+  <w:abstractNum w:abstractNumId="1" w15:restartNumberingAfterBreak="0">
+    <w:nsid w:val="0863794A"/>
+    <w:multiLevelType w:val="multilevel"/>
+    <w:tmpl w:val="C444E984"/>
+    <w:lvl w:ilvl="0">
+      <w:start w:val="1"/>
+      <w:numFmt w:val="bullet"/>
+      <w:lvlText w:val=""/>
+      <w:lvlJc w:val="left"/>
+      <w:pPr>
+        <w:tabs>
+          <w:tab w:val="num" w:pos="720"/>
+        </w:tabs>
+        <w:ind w:left="720" w:hanging="360"/>
+      </w:pPr>
+      <w:rPr>
+        <w:rFonts w:ascii="Symbol" w:hAnsi="Symbol" w:hint="default"/>
+        <w:sz w:val="20"/>
+      </w:rPr>
+    </w:lvl>
+    <w:lvl w:ilvl="1" w:tentative="1">
+      <w:start w:val="1"/>
+      <w:numFmt w:val="bullet"/>
+      <w:lvlText w:val="o"/>
+      <w:lvlJc w:val="left"/>
+      <w:pPr>
+        <w:tabs>
+          <w:tab w:val="num" w:pos="1440"/>
+        </w:tabs>
+        <w:ind w:left="1440" w:hanging="360"/>
+      </w:pPr>
+      <w:rPr>
+        <w:rFonts w:ascii="Courier New" w:hAnsi="Courier New" w:hint="default"/>
+        <w:sz w:val="20"/>
+      </w:rPr>
+    </w:lvl>
+    <w:lvl w:ilvl="2" w:tentative="1">
+      <w:start w:val="1"/>
+      <w:numFmt w:val="bullet"/>
+      <w:lvlText w:val=""/>
+      <w:lvlJc w:val="left"/>
+      <w:pPr>
+        <w:tabs>
+          <w:tab w:val="num" w:pos="2160"/>
+        </w:tabs>
+        <w:ind w:left="2160" w:hanging="360"/>
+      </w:pPr>
+      <w:rPr>
+        <w:rFonts w:ascii="Wingdings" w:hAnsi="Wingdings" w:hint="default"/>
+        <w:sz w:val="20"/>
+      </w:rPr>
+    </w:lvl>
+    <w:lvl w:ilvl="3" w:tentative="1">
+      <w:start w:val="1"/>
+      <w:numFmt w:val="bullet"/>
+      <w:lvlText w:val=""/>
+      <w:lvlJc w:val="left"/>
+      <w:pPr>
+        <w:tabs>
+          <w:tab w:val="num" w:pos="2880"/>
+        </w:tabs>
+        <w:ind w:left="2880" w:hanging="360"/>
+      </w:pPr>
+      <w:rPr>
+        <w:rFonts w:ascii="Wingdings" w:hAnsi="Wingdings" w:hint="default"/>
+        <w:sz w:val="20"/>
+      </w:rPr>
+    </w:lvl>
+    <w:lvl w:ilvl="4" w:tentative="1">
+      <w:start w:val="1"/>
+      <w:numFmt w:val="bullet"/>
+      <w:lvlText w:val=""/>
+      <w:lvlJc w:val="left"/>
+      <w:pPr>
+        <w:tabs>
+          <w:tab w:val="num" w:pos="3600"/>
+        </w:tabs>
+        <w:ind w:left="3600" w:hanging="360"/>
+      </w:pPr>
+      <w:rPr>
+        <w:rFonts w:ascii="Wingdings" w:hAnsi="Wingdings" w:hint="default"/>
+        <w:sz w:val="20"/>
+      </w:rPr>
+    </w:lvl>
+    <w:lvl w:ilvl="5" w:tentative="1">
+      <w:start w:val="1"/>
+      <w:numFmt w:val="bullet"/>
+      <w:lvlText w:val=""/>
+      <w:lvlJc w:val="left"/>
+      <w:pPr>
+        <w:tabs>
+          <w:tab w:val="num" w:pos="4320"/>
+        </w:tabs>
+        <w:ind w:left="4320" w:hanging="360"/>
+      </w:pPr>
+      <w:rPr>
+        <w:rFonts w:ascii="Wingdings" w:hAnsi="Wingdings" w:hint="default"/>
+        <w:sz w:val="20"/>
+      </w:rPr>
+    </w:lvl>
+    <w:lvl w:ilvl="6" w:tentative="1">
+      <w:start w:val="1"/>
+      <w:numFmt w:val="bullet"/>
+      <w:lvlText w:val=""/>
+      <w:lvlJc w:val="left"/>
+      <w:pPr>
+        <w:tabs>
+          <w:tab w:val="num" w:pos="5040"/>
+        </w:tabs>
+        <w:ind w:left="5040" w:hanging="360"/>
+      </w:pPr>
+      <w:rPr>
+        <w:rFonts w:ascii="Wingdings" w:hAnsi="Wingdings" w:hint="default"/>
+        <w:sz w:val="20"/>
+      </w:rPr>
+    </w:lvl>
+    <w:lvl w:ilvl="7" w:tentative="1">
+      <w:start w:val="1"/>
+      <w:numFmt w:val="bullet"/>
+      <w:lvlText w:val=""/>
+      <w:lvlJc w:val="left"/>
+      <w:pPr>
+        <w:tabs>
+          <w:tab w:val="num" w:pos="5760"/>
+        </w:tabs>
+        <w:ind w:left="5760" w:hanging="360"/>
+      </w:pPr>
+      <w:rPr>
+        <w:rFonts w:ascii="Wingdings" w:hAnsi="Wingdings" w:hint="default"/>
+        <w:sz w:val="20"/>
+      </w:rPr>
+    </w:lvl>
+    <w:lvl w:ilvl="8" w:tentative="1">
+      <w:start w:val="1"/>
+      <w:numFmt w:val="bullet"/>
+      <w:lvlText w:val=""/>
+      <w:lvlJc w:val="left"/>
+      <w:pPr>
+        <w:tabs>
+          <w:tab w:val="num" w:pos="6480"/>
+        </w:tabs>
+        <w:ind w:left="6480" w:hanging="360"/>
+      </w:pPr>
+      <w:rPr>
+        <w:rFonts w:ascii="Wingdings" w:hAnsi="Wingdings" w:hint="default"/>
+        <w:sz w:val="20"/>
+      </w:rPr>
+    </w:lvl>
+  </w:abstractNum>
+  <w:abstractNum w:abstractNumId="2" w15:restartNumberingAfterBreak="0">
+    <w:nsid w:val="20102899"/>
+    <w:multiLevelType w:val="hybridMultilevel"/>
+    <w:tmpl w:val="28A4AA1E"/>
+    <w:lvl w:ilvl="0" w:tplc="E814D7AA">
+      <w:start w:val="1"/>
+      <w:numFmt w:val="bullet"/>
+      <w:lvlText w:val=""/>
+      <w:lvlJc w:val="left"/>
+      <w:pPr>
+        <w:ind w:left="720" w:hanging="360"/>
+      </w:pPr>
+      <w:rPr>
+        <w:rFonts w:ascii="Symbol" w:hAnsi="Symbol" w:hint="default"/>
+      </w:rPr>
+    </w:lvl>
+    <w:lvl w:ilvl="1" w:tplc="19845942">
+      <w:start w:val="1"/>
+      <w:numFmt w:val="bullet"/>
+      <w:lvlText w:val="o"/>
+      <w:lvlJc w:val="left"/>
+      <w:pPr>
+        <w:ind w:left="1440" w:hanging="360"/>
+      </w:pPr>
+      <w:rPr>
+        <w:rFonts w:ascii="Courier New" w:hAnsi="Courier New" w:hint="default"/>
+      </w:rPr>
+    </w:lvl>
+    <w:lvl w:ilvl="2" w:tplc="A5C6268A">
+      <w:start w:val="1"/>
+      <w:numFmt w:val="bullet"/>
+      <w:lvlText w:val=""/>
+      <w:lvlJc w:val="left"/>
+      <w:pPr>
+        <w:ind w:left="2160" w:hanging="360"/>
+      </w:pPr>
+      <w:rPr>
+        <w:rFonts w:ascii="Wingdings" w:hAnsi="Wingdings" w:hint="default"/>
+      </w:rPr>
+    </w:lvl>
+    <w:lvl w:ilvl="3" w:tplc="BEF8D28A">
+      <w:start w:val="1"/>
+      <w:numFmt w:val="bullet"/>
+      <w:lvlText w:val=""/>
+      <w:lvlJc w:val="left"/>
+      <w:pPr>
+        <w:ind w:left="2880" w:hanging="360"/>
+      </w:pPr>
+      <w:rPr>
+        <w:rFonts w:ascii="Symbol" w:hAnsi="Symbol" w:hint="default"/>
+      </w:rPr>
+    </w:lvl>
+    <w:lvl w:ilvl="4" w:tplc="AEF81200">
+      <w:start w:val="1"/>
+      <w:numFmt w:val="bullet"/>
+      <w:lvlText w:val="o"/>
+      <w:lvlJc w:val="left"/>
+      <w:pPr>
+        <w:ind w:left="3600" w:hanging="360"/>
+      </w:pPr>
+      <w:rPr>
+        <w:rFonts w:ascii="Courier New" w:hAnsi="Courier New" w:hint="default"/>
+      </w:rPr>
+    </w:lvl>
+    <w:lvl w:ilvl="5" w:tplc="E69A568C">
+      <w:start w:val="1"/>
+      <w:numFmt w:val="bullet"/>
+      <w:lvlText w:val=""/>
+      <w:lvlJc w:val="left"/>
+      <w:pPr>
+        <w:ind w:left="4320" w:hanging="360"/>
+      </w:pPr>
+      <w:rPr>
+        <w:rFonts w:ascii="Wingdings" w:hAnsi="Wingdings" w:hint="default"/>
+      </w:rPr>
+    </w:lvl>
+    <w:lvl w:ilvl="6" w:tplc="90800494">
+      <w:start w:val="1"/>
+      <w:numFmt w:val="bullet"/>
+      <w:lvlText w:val=""/>
+      <w:lvlJc w:val="left"/>
+      <w:pPr>
+        <w:ind w:left="5040" w:hanging="360"/>
+      </w:pPr>
+      <w:rPr>
+        <w:rFonts w:ascii="Symbol" w:hAnsi="Symbol" w:hint="default"/>
+      </w:rPr>
+    </w:lvl>
+    <w:lvl w:ilvl="7" w:tplc="E0C0AA66">
+      <w:start w:val="1"/>
+      <w:numFmt w:val="bullet"/>
+      <w:lvlText w:val="o"/>
+      <w:lvlJc w:val="left"/>
+      <w:pPr>
+        <w:ind w:left="5760" w:hanging="360"/>
+      </w:pPr>
+      <w:rPr>
+        <w:rFonts w:ascii="Courier New" w:hAnsi="Courier New" w:hint="default"/>
+      </w:rPr>
+    </w:lvl>
+    <w:lvl w:ilvl="8" w:tplc="988CB23C">
+      <w:start w:val="1"/>
+      <w:numFmt w:val="bullet"/>
+      <w:lvlText w:val=""/>
+      <w:lvlJc w:val="left"/>
+      <w:pPr>
+        <w:ind w:left="6480" w:hanging="360"/>
+      </w:pPr>
+      <w:rPr>
+        <w:rFonts w:ascii="Wingdings" w:hAnsi="Wingdings" w:hint="default"/>
+      </w:rPr>
+    </w:lvl>
+  </w:abstractNum>
+  <w:abstractNum w:abstractNumId="3" w15:restartNumberingAfterBreak="0">
+    <w:nsid w:val="46474AF4"/>
+    <w:multiLevelType w:val="multilevel"/>
+    <w:tmpl w:val="6D865092"/>
+    <w:lvl w:ilvl="0">
+      <w:start w:val="1"/>
+      <w:numFmt w:val="bullet"/>
+      <w:lvlText w:val=""/>
+      <w:lvlJc w:val="left"/>
+      <w:pPr>
+        <w:tabs>
+          <w:tab w:val="num" w:pos="720"/>
+        </w:tabs>
+        <w:ind w:left="720" w:hanging="360"/>
+      </w:pPr>
+      <w:rPr>
+        <w:rFonts w:ascii="Symbol" w:hAnsi="Symbol" w:hint="default"/>
+        <w:sz w:val="20"/>
+      </w:rPr>
+    </w:lvl>
+    <w:lvl w:ilvl="1" w:tentative="1">
+      <w:start w:val="1"/>
+      <w:numFmt w:val="bullet"/>
+      <w:lvlText w:val="o"/>
+      <w:lvlJc w:val="left"/>
+      <w:pPr>
+        <w:tabs>
+          <w:tab w:val="num" w:pos="1440"/>
+        </w:tabs>
+        <w:ind w:left="1440" w:hanging="360"/>
+      </w:pPr>
+      <w:rPr>
+        <w:rFonts w:ascii="Courier New" w:hAnsi="Courier New" w:hint="default"/>
+        <w:sz w:val="20"/>
+      </w:rPr>
+    </w:lvl>
+    <w:lvl w:ilvl="2" w:tentative="1">
+      <w:start w:val="1"/>
+      <w:numFmt w:val="bullet"/>
+      <w:lvlText w:val=""/>
+      <w:lvlJc w:val="left"/>
+      <w:pPr>
+        <w:tabs>
+          <w:tab w:val="num" w:pos="2160"/>
+        </w:tabs>
+        <w:ind w:left="2160" w:hanging="360"/>
+      </w:pPr>
+      <w:rPr>
+        <w:rFonts w:ascii="Wingdings" w:hAnsi="Wingdings" w:hint="default"/>
+        <w:sz w:val="20"/>
+      </w:rPr>
+    </w:lvl>
+    <w:lvl w:ilvl="3" w:tentative="1">
+      <w:start w:val="1"/>
+      <w:numFmt w:val="bullet"/>
+      <w:lvlText w:val=""/>
+      <w:lvlJc w:val="left"/>
+      <w:pPr>
+        <w:tabs>
+          <w:tab w:val="num" w:pos="2880"/>
+        </w:tabs>
+        <w:ind w:left="2880" w:hanging="360"/>
+      </w:pPr>
+      <w:rPr>
+        <w:rFonts w:ascii="Wingdings" w:hAnsi="Wingdings" w:hint="default"/>
+        <w:sz w:val="20"/>
+      </w:rPr>
+    </w:lvl>
+    <w:lvl w:ilvl="4" w:tentative="1">
+      <w:start w:val="1"/>
+      <w:numFmt w:val="bullet"/>
+      <w:lvlText w:val=""/>
+      <w:lvlJc w:val="left"/>
+      <w:pPr>
+        <w:tabs>
+          <w:tab w:val="num" w:pos="3600"/>
+        </w:tabs>
+        <w:ind w:left="3600" w:hanging="360"/>
+      </w:pPr>
+      <w:rPr>
+        <w:rFonts w:ascii="Wingdings" w:hAnsi="Wingdings" w:hint="default"/>
+        <w:sz w:val="20"/>
+      </w:rPr>
+    </w:lvl>
+    <w:lvl w:ilvl="5" w:tentative="1">
+      <w:start w:val="1"/>
+      <w:numFmt w:val="bullet"/>
+      <w:lvlText w:val=""/>
+      <w:lvlJc w:val="left"/>
+      <w:pPr>
+        <w:tabs>
+          <w:tab w:val="num" w:pos="4320"/>
+        </w:tabs>
+        <w:ind w:left="4320" w:hanging="360"/>
+      </w:pPr>
+      <w:rPr>
+        <w:rFonts w:ascii="Wingdings" w:hAnsi="Wingdings" w:hint="default"/>
+        <w:sz w:val="20"/>
+      </w:rPr>
+    </w:lvl>
+    <w:lvl w:ilvl="6" w:tentative="1">
+      <w:start w:val="1"/>
+      <w:numFmt w:val="bullet"/>
+      <w:lvlText w:val=""/>
+      <w:lvlJc w:val="left"/>
+      <w:pPr>
+        <w:tabs>
+          <w:tab w:val="num" w:pos="5040"/>
+        </w:tabs>
+        <w:ind w:left="5040" w:hanging="360"/>
+      </w:pPr>
+      <w:rPr>
+        <w:rFonts w:ascii="Wingdings" w:hAnsi="Wingdings" w:hint="default"/>
+        <w:sz w:val="20"/>
+      </w:rPr>
+    </w:lvl>
+    <w:lvl w:ilvl="7" w:tentative="1">
+      <w:start w:val="1"/>
+      <w:numFmt w:val="bullet"/>
+      <w:lvlText w:val=""/>
+      <w:lvlJc w:val="left"/>
+      <w:pPr>
+        <w:tabs>
+          <w:tab w:val="num" w:pos="5760"/>
+        </w:tabs>
+        <w:ind w:left="5760" w:hanging="360"/>
+      </w:pPr>
+      <w:rPr>
+        <w:rFonts w:ascii="Wingdings" w:hAnsi="Wingdings" w:hint="default"/>
+        <w:sz w:val="20"/>
+      </w:rPr>
+    </w:lvl>
+    <w:lvl w:ilvl="8" w:tentative="1">
+      <w:start w:val="1"/>
+      <w:numFmt w:val="bullet"/>
+      <w:lvlText w:val=""/>
+      <w:lvlJc w:val="left"/>
+      <w:pPr>
+        <w:tabs>
+          <w:tab w:val="num" w:pos="6480"/>
+        </w:tabs>
+        <w:ind w:left="6480" w:hanging="360"/>
+      </w:pPr>
+      <w:rPr>
+        <w:rFonts w:ascii="Wingdings" w:hAnsi="Wingdings" w:hint="default"/>
+        <w:sz w:val="20"/>
+      </w:rPr>
+    </w:lvl>
+  </w:abstractNum>
+  <w:abstractNum w:abstractNumId="4" w15:restartNumberingAfterBreak="0">
+    <w:nsid w:val="6A174487"/>
+    <w:multiLevelType w:val="hybridMultilevel"/>
+    <w:tmpl w:val="23142306"/>
+    <w:lvl w:ilvl="0" w:tplc="888CF336">
+      <w:numFmt w:val="bullet"/>
+      <w:lvlText w:val="-"/>
+      <w:lvlJc w:val="left"/>
+      <w:pPr>
+        <w:ind w:left="720" w:hanging="360"/>
+      </w:pPr>
+      <w:rPr>
+        <w:rFonts w:ascii="Calibri" w:eastAsia="Calibri" w:hAnsi="Calibri" w:cs="Calibri" w:hint="default"/>
+        <w:b/>
+      </w:rPr>
+    </w:lvl>
+    <w:lvl w:ilvl="1" w:tplc="38090003" w:tentative="1">
+      <w:start w:val="1"/>
+      <w:numFmt w:val="bullet"/>
+      <w:lvlText w:val="o"/>
+      <w:lvlJc w:val="left"/>
+      <w:pPr>
+        <w:ind w:left="1440" w:hanging="360"/>
+      </w:pPr>
+      <w:rPr>
+        <w:rFonts w:ascii="Courier New" w:hAnsi="Courier New" w:cs="Courier New" w:hint="default"/>
+      </w:rPr>
+    </w:lvl>
+    <w:lvl w:ilvl="2" w:tplc="38090005" w:tentative="1">
+      <w:start w:val="1"/>
+      <w:numFmt w:val="bullet"/>
+      <w:lvlText w:val=""/>
+      <w:lvlJc w:val="left"/>
+      <w:pPr>
+        <w:ind w:left="2160" w:hanging="360"/>
+      </w:pPr>
+      <w:rPr>
+        <w:rFonts w:ascii="Wingdings" w:hAnsi="Wingdings" w:hint="default"/>
+      </w:rPr>
+    </w:lvl>
+    <w:lvl w:ilvl="3" w:tplc="38090001" w:tentative="1">
+      <w:start w:val="1"/>
+      <w:numFmt w:val="bullet"/>
+      <w:lvlText w:val=""/>
+      <w:lvlJc w:val="left"/>
+      <w:pPr>
+        <w:ind w:left="2880" w:hanging="360"/>
+      </w:pPr>
+      <w:rPr>
+        <w:rFonts w:ascii="Symbol" w:hAnsi="Symbol" w:hint="default"/>
+      </w:rPr>
+    </w:lvl>
+    <w:lvl w:ilvl="4" w:tplc="38090003" w:tentative="1">
+      <w:start w:val="1"/>
+      <w:numFmt w:val="bullet"/>
+      <w:lvlText w:val="o"/>
+      <w:lvlJc w:val="left"/>
+      <w:pPr>
+        <w:ind w:left="3600" w:hanging="360"/>
+      </w:pPr>
+      <w:rPr>
+        <w:rFonts w:ascii="Courier New" w:hAnsi="Courier New" w:cs="Courier New" w:hint="default"/>
+      </w:rPr>
+    </w:lvl>
+    <w:lvl w:ilvl="5" w:tplc="38090005" w:tentative="1">
+      <w:start w:val="1"/>
+      <w:numFmt w:val="bullet"/>
+      <w:lvlText w:val=""/>
+      <w:lvlJc w:val="left"/>
+      <w:pPr>
+        <w:ind w:left="4320" w:hanging="360"/>
+      </w:pPr>
+      <w:rPr>
+        <w:rFonts w:ascii="Wingdings" w:hAnsi="Wingdings" w:hint="default"/>
+      </w:rPr>
+    </w:lvl>
+    <w:lvl w:ilvl="6" w:tplc="38090001" w:tentative="1">
+      <w:start w:val="1"/>
+      <w:numFmt w:val="bullet"/>
+      <w:lvlText w:val=""/>
+      <w:lvlJc w:val="left"/>
+      <w:pPr>
+        <w:ind w:left="5040" w:hanging="360"/>
+      </w:pPr>
+      <w:rPr>
+        <w:rFonts w:ascii="Symbol" w:hAnsi="Symbol" w:hint="default"/>
+      </w:rPr>
+    </w:lvl>
+    <w:lvl w:ilvl="7" w:tplc="38090003" w:tentative="1">
+      <w:start w:val="1"/>
+      <w:numFmt w:val="bullet"/>
+      <w:lvlText w:val="o"/>
+      <w:lvlJc w:val="left"/>
+      <w:pPr>
+        <w:ind w:left="5760" w:hanging="360"/>
+      </w:pPr>
+      <w:rPr>
+        <w:rFonts w:ascii="Courier New" w:hAnsi="Courier New" w:cs="Courier New" w:hint="default"/>
+      </w:rPr>
+    </w:lvl>
+    <w:lvl w:ilvl="8" w:tplc="38090005" w:tentative="1">
+      <w:start w:val="1"/>
+      <w:numFmt w:val="bullet"/>
+      <w:lvlText w:val=""/>
+      <w:lvlJc w:val="left"/>
+      <w:pPr>
+        <w:ind w:left="6480" w:hanging="360"/>
+      </w:pPr>
+      <w:rPr>
+        <w:rFonts w:ascii="Wingdings" w:hAnsi="Wingdings" w:hint="default"/>
+      </w:rPr>
+    </w:lvl>
+  </w:abstractNum>
+  <w:abstractNum w:abstractNumId="5" w15:restartNumberingAfterBreak="0">
+    <w:nsid w:val="706A61F2"/>
+    <w:multiLevelType w:val="hybridMultilevel"/>
+    <w:tmpl w:val="8674AD38"/>
+    <w:lvl w:ilvl="0" w:tplc="F0324142">
+      <w:start w:val="1"/>
+      <w:numFmt w:val="bullet"/>
+      <w:lvlText w:val=""/>
+      <w:lvlJc w:val="left"/>
+      <w:pPr>
+        <w:ind w:left="720" w:hanging="360"/>
+      </w:pPr>
+      <w:rPr>
+        <w:rFonts w:ascii="Symbol" w:hAnsi="Symbol" w:hint="default"/>
+      </w:rPr>
+    </w:lvl>
+    <w:lvl w:ilvl="1" w:tplc="1358749A">
+      <w:start w:val="1"/>
+      <w:numFmt w:val="bullet"/>
+      <w:lvlText w:val="o"/>
+      <w:lvlJc w:val="left"/>
+      <w:pPr>
+        <w:ind w:left="1440" w:hanging="360"/>
+      </w:pPr>
+      <w:rPr>
+        <w:rFonts w:ascii="Courier New" w:hAnsi="Courier New" w:hint="default"/>
+      </w:rPr>
+    </w:lvl>
+    <w:lvl w:ilvl="2" w:tplc="A530C89E">
+      <w:start w:val="1"/>
+      <w:numFmt w:val="bullet"/>
+      <w:lvlText w:val=""/>
+      <w:lvlJc w:val="left"/>
+      <w:pPr>
+        <w:ind w:left="2160" w:hanging="360"/>
+      </w:pPr>
+      <w:rPr>
+        <w:rFonts w:ascii="Wingdings" w:hAnsi="Wingdings" w:hint="default"/>
+      </w:rPr>
+    </w:lvl>
+    <w:lvl w:ilvl="3" w:tplc="13064172">
+      <w:start w:val="1"/>
+      <w:numFmt w:val="bullet"/>
+      <w:lvlText w:val=""/>
+      <w:lvlJc w:val="left"/>
+      <w:pPr>
+        <w:ind w:left="2880" w:hanging="360"/>
+      </w:pPr>
+      <w:rPr>
+        <w:rFonts w:ascii="Symbol" w:hAnsi="Symbol" w:hint="default"/>
+      </w:rPr>
+    </w:lvl>
+    <w:lvl w:ilvl="4" w:tplc="2B8AA878">
+      <w:start w:val="1"/>
+      <w:numFmt w:val="bullet"/>
+      <w:lvlText w:val="o"/>
+      <w:lvlJc w:val="left"/>
+      <w:pPr>
+        <w:ind w:left="3600" w:hanging="360"/>
+      </w:pPr>
+      <w:rPr>
+        <w:rFonts w:ascii="Courier New" w:hAnsi="Courier New" w:hint="default"/>
+      </w:rPr>
+    </w:lvl>
+    <w:lvl w:ilvl="5" w:tplc="7044704C">
+      <w:start w:val="1"/>
+      <w:numFmt w:val="bullet"/>
+      <w:lvlText w:val=""/>
+      <w:lvlJc w:val="left"/>
+      <w:pPr>
+        <w:ind w:left="4320" w:hanging="360"/>
+      </w:pPr>
+      <w:rPr>
+        <w:rFonts w:ascii="Wingdings" w:hAnsi="Wingdings" w:hint="default"/>
+      </w:rPr>
+    </w:lvl>
+    <w:lvl w:ilvl="6" w:tplc="71C88D14">
+      <w:start w:val="1"/>
+      <w:numFmt w:val="bullet"/>
+      <w:lvlText w:val=""/>
+      <w:lvlJc w:val="left"/>
+      <w:pPr>
+        <w:ind w:left="5040" w:hanging="360"/>
+      </w:pPr>
+      <w:rPr>
+        <w:rFonts w:ascii="Symbol" w:hAnsi="Symbol" w:hint="default"/>
+      </w:rPr>
+    </w:lvl>
+    <w:lvl w:ilvl="7" w:tplc="B3AC79FE">
+      <w:start w:val="1"/>
+      <w:numFmt w:val="bullet"/>
+      <w:lvlText w:val="o"/>
+      <w:lvlJc w:val="left"/>
+      <w:pPr>
+        <w:ind w:left="5760" w:hanging="360"/>
+      </w:pPr>
+      <w:rPr>
+        <w:rFonts w:ascii="Courier New" w:hAnsi="Courier New" w:hint="default"/>
+      </w:rPr>
+    </w:lvl>
+    <w:lvl w:ilvl="8" w:tplc="9332478C">
+      <w:start w:val="1"/>
+      <w:numFmt w:val="bullet"/>
+      <w:lvlText w:val=""/>
+      <w:lvlJc w:val="left"/>
+      <w:pPr>
+        <w:ind w:left="6480" w:hanging="360"/>
+      </w:pPr>
+      <w:rPr>
+        <w:rFonts w:ascii="Wingdings" w:hAnsi="Wingdings" w:hint="default"/>
+      </w:rPr>
+    </w:lvl>
+  </w:abstractNum>
+  <w:abstractNum w:abstractNumId="6" w15:restartNumberingAfterBreak="0">
+    <w:nsid w:val="7A79056E"/>
+    <w:multiLevelType w:val="hybridMultilevel"/>
+    <w:tmpl w:val="D23CF662"/>
+    <w:lvl w:ilvl="0" w:tplc="AEAEEB36">
+      <w:start w:val="1"/>
+      <w:numFmt w:val="bullet"/>
+      <w:lvlText w:val=""/>
+      <w:lvlJc w:val="left"/>
+      <w:pPr>
+        <w:ind w:left="720" w:hanging="360"/>
+      </w:pPr>
+      <w:rPr>
+        <w:rFonts w:ascii="Symbol" w:hAnsi="Symbol" w:hint="default"/>
+      </w:rPr>
+    </w:lvl>
+    <w:lvl w:ilvl="1" w:tplc="0D2CBE74">
+      <w:start w:val="1"/>
+      <w:numFmt w:val="bullet"/>
+      <w:lvlText w:val="o"/>
+      <w:lvlJc w:val="left"/>
+      <w:pPr>
+        <w:ind w:left="1440" w:hanging="360"/>
+      </w:pPr>
+      <w:rPr>
+        <w:rFonts w:ascii="Courier New" w:hAnsi="Courier New" w:hint="default"/>
+      </w:rPr>
+    </w:lvl>
+    <w:lvl w:ilvl="2" w:tplc="DFCE8BB6">
+      <w:start w:val="1"/>
+      <w:numFmt w:val="bullet"/>
+      <w:lvlText w:val=""/>
+      <w:lvlJc w:val="left"/>
+      <w:pPr>
+        <w:ind w:left="2160" w:hanging="360"/>
+      </w:pPr>
+      <w:rPr>
+        <w:rFonts w:ascii="Wingdings" w:hAnsi="Wingdings" w:hint="default"/>
+      </w:rPr>
+    </w:lvl>
+    <w:lvl w:ilvl="3" w:tplc="27C626D4">
+      <w:start w:val="1"/>
+      <w:numFmt w:val="bullet"/>
+      <w:lvlText w:val=""/>
+      <w:lvlJc w:val="left"/>
+      <w:pPr>
+        <w:ind w:left="2880" w:hanging="360"/>
+      </w:pPr>
+      <w:rPr>
+        <w:rFonts w:ascii="Symbol" w:hAnsi="Symbol" w:hint="default"/>
+      </w:rPr>
+    </w:lvl>
+    <w:lvl w:ilvl="4" w:tplc="EA320388">
+      <w:start w:val="1"/>
+      <w:numFmt w:val="bullet"/>
+      <w:lvlText w:val="o"/>
+      <w:lvlJc w:val="left"/>
+      <w:pPr>
+        <w:ind w:left="3600" w:hanging="360"/>
+      </w:pPr>
+      <w:rPr>
+        <w:rFonts w:ascii="Courier New" w:hAnsi="Courier New" w:hint="default"/>
+      </w:rPr>
+    </w:lvl>
+    <w:lvl w:ilvl="5" w:tplc="D5AA982C">
+      <w:start w:val="1"/>
+      <w:numFmt w:val="bullet"/>
+      <w:lvlText w:val=""/>
+      <w:lvlJc w:val="left"/>
+      <w:pPr>
+        <w:ind w:left="4320" w:hanging="360"/>
+      </w:pPr>
+      <w:rPr>
+        <w:rFonts w:ascii="Wingdings" w:hAnsi="Wingdings" w:hint="default"/>
+      </w:rPr>
+    </w:lvl>
+    <w:lvl w:ilvl="6" w:tplc="49A0E0EE">
+      <w:start w:val="1"/>
+      <w:numFmt w:val="bullet"/>
+      <w:lvlText w:val=""/>
+      <w:lvlJc w:val="left"/>
+      <w:pPr>
+        <w:ind w:left="5040" w:hanging="360"/>
+      </w:pPr>
+      <w:rPr>
+        <w:rFonts w:ascii="Symbol" w:hAnsi="Symbol" w:hint="default"/>
+      </w:rPr>
+    </w:lvl>
+    <w:lvl w:ilvl="7" w:tplc="BF26B806">
+      <w:start w:val="1"/>
+      <w:numFmt w:val="bullet"/>
+      <w:lvlText w:val="o"/>
+      <w:lvlJc w:val="left"/>
+      <w:pPr>
+        <w:ind w:left="5760" w:hanging="360"/>
+      </w:pPr>
+      <w:rPr>
+        <w:rFonts w:ascii="Courier New" w:hAnsi="Courier New" w:hint="default"/>
+      </w:rPr>
+    </w:lvl>
+    <w:lvl w:ilvl="8" w:tplc="35FA206E">
+      <w:start w:val="1"/>
+      <w:numFmt w:val="bullet"/>
+      <w:lvlText w:val=""/>
+      <w:lvlJc w:val="left"/>
+      <w:pPr>
+        <w:ind w:left="6480" w:hanging="360"/>
+      </w:pPr>
+      <w:rPr>
+        <w:rFonts w:ascii="Wingdings" w:hAnsi="Wingdings" w:hint="default"/>
+      </w:rPr>
+    </w:lvl>
+  </w:abstractNum>
+  <w:num w:numId="1" w16cid:durableId="350188098">
+    <w:abstractNumId w:val="6"/>
+  </w:num>
+  <w:num w:numId="2" w16cid:durableId="921139565">
+    <w:abstractNumId w:val="5"/>
+  </w:num>
+  <w:num w:numId="3" w16cid:durableId="966743431">
+    <w:abstractNumId w:val="2"/>
+  </w:num>
+  <w:num w:numId="4" w16cid:durableId="1560434364">
     <w:abstractNumId w:val="0"/>
     <w:lvlOverride w:ilvl="0">
       <w:startOverride w:val="1"/>
     </w:lvlOverride>
   </w:num>
+  <w:num w:numId="5" w16cid:durableId="30031595">
+    <w:abstractNumId w:val="1"/>
+  </w:num>
+  <w:num w:numId="6" w16cid:durableId="334577589">
+    <w:abstractNumId w:val="4"/>
+  </w:num>
+  <w:num w:numId="7" w16cid:durableId="843669650">
+    <w:abstractNumId w:val="3"/>
+  </w:num>
 </w:numbering>
 </file>
 
 <file path=word/styles.xml><?xml version="1.0" encoding="utf-8"?>
-<w:styles xmlns:mc="http://schemas.openxmlformats.org/markup-compatibility/2006" xmlns:r="http://schemas.openxmlformats.org/officeDocument/2006/relationships" xmlns:w="http://schemas.openxmlformats.org/wordprocessingml/2006/main" xmlns:w14="http://schemas.microsoft.com/office/word/2010/wordml" xmlns:w15="http://schemas.microsoft.com/office/word/2012/wordml" xmlns:w16cex="http://schemas.microsoft.com/office/word/2018/wordml/cex" xmlns:w16cid="http://schemas.microsoft.com/office/word/2016/wordml/cid" xmlns:w16="http://schemas.microsoft.com/office/word/2018/wordml" xmlns:w16sdtdh="http://schemas.microsoft.com/office/word/2020/wordml/sdtdatahash" xmlns:w16sdtfl="http://schemas.microsoft.com/office/word/2024/wordml/sdtformatlock" xmlns:w16se="http://schemas.microsoft.com/office/word/2015/wordml/symex" xmlns:w16du="http://schemas.microsoft.com/office/word/2023/wordml/word16du" mc:Ignorable="w14 w15 w16se w16cid w16 w16cex w16sdtdh w16sdtfl w16du">
+<w:styles xmlns:mc="http://schemas.openxmlformats.org/markup-compatibility/2006" xmlns:r="http://schemas.openxmlformats.org/officeDocument/2006/relationships" xmlns:w="http://schemas.openxmlformats.org/wordprocessingml/2006/main" xmlns:w14="http://schemas.microsoft.com/office/word/2010/wordml" xmlns:w15="http://schemas.microsoft.com/office/word/2012/wordml" xmlns:w16cex="http://schemas.microsoft.com/office/word/2018/wordml/cex" xmlns:w16cid="http://schemas.microsoft.com/office/word/2016/wordml/cid" xmlns:w16="http://schemas.microsoft.com/office/word/2018/wordml" xmlns:w16du="http://schemas.microsoft.com/office/word/2023/wordml/word16du" xmlns:w16sdtdh="http://schemas.microsoft.com/office/word/2020/wordml/sdtdatahash" xmlns:w16sdtfl="http://schemas.microsoft.com/office/word/2024/wordml/sdtformatlock" xmlns:w16se="http://schemas.microsoft.com/office/word/2015/wordml/symex" mc:Ignorable="w14 w15 w16se w16cid w16 w16cex w16sdtdh w16sdtfl w16du">
   <w:docDefaults>
     <w:rPrDefault>
       <w:rPr>
@@ -2679,9 +5221,11 @@
   <w:style w:type="paragraph" w:default="1" w:styleId="Normal">
     <w:name w:val="Normal"/>
     <w:qFormat/>
+    <w:rsid w:val="00001659"/>
   </w:style>
   <w:style w:type="paragraph" w:styleId="Heading1">
     <w:name w:val="heading 1"/>
+    <w:link w:val="Heading1Char"/>
     <w:uiPriority w:val="9"/>
     <w:qFormat/>
     <w:pPr>
@@ -2958,6 +5502,33 @@
     <w:link w:val="Footer"/>
     <w:uiPriority w:val="99"/>
     <w:rsid w:val="00F95A76"/>
+  </w:style>
+  <w:style w:type="character" w:customStyle="1" w:styleId="Heading1Char">
+    <w:name w:val="Heading 1 Char"/>
+    <w:basedOn w:val="DefaultParagraphFont"/>
+    <w:link w:val="Heading1"/>
+    <w:uiPriority w:val="9"/>
+    <w:rsid w:val="00BD55C8"/>
+    <w:rPr>
+      <w:rFonts w:ascii="Cambria" w:eastAsia="Cambria" w:hAnsi="Cambria" w:cs="Cambria"/>
+      <w:b/>
+      <w:bCs/>
+      <w:color w:val="1E2761"/>
+      <w:sz w:val="26"/>
+      <w:szCs w:val="26"/>
+    </w:rPr>
+  </w:style>
+  <w:style w:type="character" w:styleId="FollowedHyperlink">
+    <w:name w:val="FollowedHyperlink"/>
+    <w:basedOn w:val="DefaultParagraphFont"/>
+    <w:uiPriority w:val="99"/>
+    <w:semiHidden/>
+    <w:unhideWhenUsed/>
+    <w:rsid w:val="006934E7"/>
+    <w:rPr>
+      <w:color w:val="96607D" w:themeColor="followedHyperlink"/>
+      <w:u w:val="single"/>
+    </w:rPr>
   </w:style>
 </w:styles>
 </file>
@@ -3277,6 +5848,239 @@
 </a:theme>
 </file>
 
+<file path=customXml/item1.xml><?xml version="1.0" encoding="utf-8"?>
+<p:properties xmlns:p="http://schemas.microsoft.com/office/2006/metadata/properties" xmlns:xsi="http://www.w3.org/2001/XMLSchema-instance" xmlns:pc="http://schemas.microsoft.com/office/infopath/2007/PartnerControls">
+  <documentManagement>
+    <lcf76f155ced4ddcb4097134ff3c332f xmlns="01d5e555-494a-40ad-b5bc-1378a5d8ad0d">
+      <Terms xmlns="http://schemas.microsoft.com/office/infopath/2007/PartnerControls"/>
+    </lcf76f155ced4ddcb4097134ff3c332f>
+  </documentManagement>
+</p:properties>
+</file>
+
+<file path=customXml/item2.xml><?xml version="1.0" encoding="utf-8"?>
+<?mso-contentType ?>
+<FormTemplates xmlns="http://schemas.microsoft.com/sharepoint/v3/contenttype/forms">
+  <Display>DocumentLibraryForm</Display>
+  <Edit>DocumentLibraryForm</Edit>
+  <New>DocumentLibraryForm</New>
+</FormTemplates>
+</file>
+
+<file path=customXml/item3.xml><?xml version="1.0" encoding="utf-8"?>
+<ct:contentTypeSchema xmlns:ct="http://schemas.microsoft.com/office/2006/metadata/contentType" xmlns:ma="http://schemas.microsoft.com/office/2006/metadata/properties/metaAttributes" ct:_="" ma:_="" ma:contentTypeName="Document" ma:contentTypeID="0x01010032B022E3FFE7534CAF83618C1EF3FEC2" ma:contentTypeVersion="10" ma:contentTypeDescription="Create a new document." ma:contentTypeScope="" ma:versionID="9512346f4a6774127efdbfb3238e8806">
+  <xsd:schema xmlns:xsd="http://www.w3.org/2001/XMLSchema" xmlns:xs="http://www.w3.org/2001/XMLSchema" xmlns:p="http://schemas.microsoft.com/office/2006/metadata/properties" xmlns:ns2="01d5e555-494a-40ad-b5bc-1378a5d8ad0d" targetNamespace="http://schemas.microsoft.com/office/2006/metadata/properties" ma:root="true" ma:fieldsID="2c38900c8230ee57c045d43f02e0574a" ns2:_="">
+    <xsd:import namespace="01d5e555-494a-40ad-b5bc-1378a5d8ad0d"/>
+    <xsd:element name="properties">
+      <xsd:complexType>
+        <xsd:sequence>
+          <xsd:element name="documentManagement">
+            <xsd:complexType>
+              <xsd:all>
+                <xsd:element ref="ns2:MediaServiceMetadata" minOccurs="0"/>
+                <xsd:element ref="ns2:MediaServiceFastMetadata" minOccurs="0"/>
+                <xsd:element ref="ns2:MediaServiceSearchProperties" minOccurs="0"/>
+                <xsd:element ref="ns2:MediaServiceDateTaken" minOccurs="0"/>
+                <xsd:element ref="ns2:MediaServiceGenerationTime" minOccurs="0"/>
+                <xsd:element ref="ns2:MediaServiceEventHashCode" minOccurs="0"/>
+                <xsd:element ref="ns2:MediaLengthInSeconds" minOccurs="0"/>
+                <xsd:element ref="ns2:lcf76f155ced4ddcb4097134ff3c332f" minOccurs="0"/>
+                <xsd:element ref="ns2:MediaServiceOCR" minOccurs="0"/>
+              </xsd:all>
+            </xsd:complexType>
+          </xsd:element>
+        </xsd:sequence>
+      </xsd:complexType>
+    </xsd:element>
+  </xsd:schema>
+  <xsd:schema xmlns:xsd="http://www.w3.org/2001/XMLSchema" xmlns:xs="http://www.w3.org/2001/XMLSchema" xmlns:dms="http://schemas.microsoft.com/office/2006/documentManagement/types" xmlns:pc="http://schemas.microsoft.com/office/infopath/2007/PartnerControls" targetNamespace="01d5e555-494a-40ad-b5bc-1378a5d8ad0d" elementFormDefault="qualified">
+    <xsd:import namespace="http://schemas.microsoft.com/office/2006/documentManagement/types"/>
+    <xsd:import namespace="http://schemas.microsoft.com/office/infopath/2007/PartnerControls"/>
+    <xsd:element name="MediaServiceMetadata" ma:index="8" nillable="true" ma:displayName="MediaServiceMetadata" ma:hidden="true" ma:internalName="MediaServiceMetadata" ma:readOnly="true">
+      <xsd:simpleType>
+        <xsd:restriction base="dms:Note"/>
+      </xsd:simpleType>
+    </xsd:element>
+    <xsd:element name="MediaServiceFastMetadata" ma:index="9" nillable="true" ma:displayName="MediaServiceFastMetadata" ma:hidden="true" ma:internalName="MediaServiceFastMetadata" ma:readOnly="true">
+      <xsd:simpleType>
+        <xsd:restriction base="dms:Note"/>
+      </xsd:simpleType>
+    </xsd:element>
+    <xsd:element name="MediaServiceSearchProperties" ma:index="10" nillable="true" ma:displayName="MediaServiceSearchProperties" ma:hidden="true" ma:internalName="MediaServiceSearchProperties" ma:readOnly="true">
+      <xsd:simpleType>
+        <xsd:restriction base="dms:Note"/>
+      </xsd:simpleType>
+    </xsd:element>
+    <xsd:element name="MediaServiceDateTaken" ma:index="11" nillable="true" ma:displayName="MediaServiceDateTaken" ma:hidden="true" ma:indexed="true" ma:internalName="MediaServiceDateTaken" ma:readOnly="true">
+      <xsd:simpleType>
+        <xsd:restriction base="dms:Text"/>
+      </xsd:simpleType>
+    </xsd:element>
+    <xsd:element name="MediaServiceGenerationTime" ma:index="12" nillable="true" ma:displayName="MediaServiceGenerationTime" ma:hidden="true" ma:internalName="MediaServiceGenerationTime" ma:readOnly="true">
+      <xsd:simpleType>
+        <xsd:restriction base="dms:Text"/>
+      </xsd:simpleType>
+    </xsd:element>
+    <xsd:element name="MediaServiceEventHashCode" ma:index="13" nillable="true" ma:displayName="MediaServiceEventHashCode" ma:hidden="true" ma:internalName="MediaServiceEventHashCode" ma:readOnly="true">
+      <xsd:simpleType>
+        <xsd:restriction base="dms:Text"/>
+      </xsd:simpleType>
+    </xsd:element>
+    <xsd:element name="MediaLengthInSeconds" ma:index="14" nillable="true" ma:displayName="MediaLengthInSeconds" ma:hidden="true" ma:internalName="MediaLengthInSeconds" ma:readOnly="true">
+      <xsd:simpleType>
+        <xsd:restriction base="dms:Unknown"/>
+      </xsd:simpleType>
+    </xsd:element>
+    <xsd:element name="lcf76f155ced4ddcb4097134ff3c332f" ma:index="16" nillable="true" ma:taxonomy="true" ma:internalName="lcf76f155ced4ddcb4097134ff3c332f" ma:taxonomyFieldName="MediaServiceImageTags" ma:displayName="Image Tags" ma:readOnly="false" ma:fieldId="{5cf76f15-5ced-4ddc-b409-7134ff3c332f}" ma:taxonomyMulti="true" ma:sspId="c921d02d-b337-4ce5-bd1c-22d9132a6b17" ma:termSetId="09814cd3-568e-fe90-9814-8d621ff8fb84" ma:anchorId="fba54fb3-c3e1-fe81-a776-ca4b69148c4d" ma:open="true" ma:isKeyword="false">
+      <xsd:complexType>
+        <xsd:sequence>
+          <xsd:element ref="pc:Terms" minOccurs="0" maxOccurs="1"/>
+        </xsd:sequence>
+      </xsd:complexType>
+    </xsd:element>
+    <xsd:element name="MediaServiceOCR" ma:index="17" nillable="true" ma:displayName="Extracted Text" ma:internalName="MediaServiceOCR" ma:readOnly="true">
+      <xsd:simpleType>
+        <xsd:restriction base="dms:Note">
+          <xsd:maxLength value="255"/>
+        </xsd:restriction>
+      </xsd:simpleType>
+    </xsd:element>
+  </xsd:schema>
+  <xsd:schema xmlns="http://schemas.openxmlformats.org/package/2006/metadata/core-properties" xmlns:xsd="http://www.w3.org/2001/XMLSchema" xmlns:xsi="http://www.w3.org/2001/XMLSchema-instance" xmlns:dc="http://purl.org/dc/elements/1.1/" xmlns:dcterms="http://purl.org/dc/terms/" xmlns:odoc="http://schemas.microsoft.com/internal/obd" targetNamespace="http://schemas.openxmlformats.org/package/2006/metadata/core-properties" elementFormDefault="qualified" attributeFormDefault="unqualified" blockDefault="#all">
+    <xsd:import namespace="http://purl.org/dc/elements/1.1/" schemaLocation="http://dublincore.org/schemas/xmls/qdc/2003/04/02/dc.xsd"/>
+    <xsd:import namespace="http://purl.org/dc/terms/" schemaLocation="http://dublincore.org/schemas/xmls/qdc/2003/04/02/dcterms.xsd"/>
+    <xsd:element name="coreProperties" type="CT_coreProperties"/>
+    <xsd:complexType name="CT_coreProperties">
+      <xsd:all>
+        <xsd:element ref="dc:creator" minOccurs="0" maxOccurs="1"/>
+        <xsd:element ref="dcterms:created" minOccurs="0" maxOccurs="1"/>
+        <xsd:element ref="dc:identifier" minOccurs="0" maxOccurs="1"/>
+        <xsd:element name="contentType" minOccurs="0" maxOccurs="1" type="xsd:string" ma:index="0" ma:displayName="Content Type"/>
+        <xsd:element ref="dc:title" minOccurs="0" maxOccurs="1" ma:index="4" ma:displayName="Title"/>
+        <xsd:element ref="dc:subject" minOccurs="0" maxOccurs="1"/>
+        <xsd:element ref="dc:description" minOccurs="0" maxOccurs="1"/>
+        <xsd:element name="keywords" minOccurs="0" maxOccurs="1" type="xsd:string"/>
+        <xsd:element ref="dc:language" minOccurs="0" maxOccurs="1"/>
+        <xsd:element name="category" minOccurs="0" maxOccurs="1" type="xsd:string"/>
+        <xsd:element name="version" minOccurs="0" maxOccurs="1" type="xsd:string"/>
+        <xsd:element name="revision" minOccurs="0" maxOccurs="1" type="xsd:string">
+          <xsd:annotation>
+            <xsd:documentation>
+                        This value indicates the number of saves or revisions. The application is responsible for updating this value after each revision.
+                    </xsd:documentation>
+          </xsd:annotation>
+        </xsd:element>
+        <xsd:element name="lastModifiedBy" minOccurs="0" maxOccurs="1" type="xsd:string"/>
+        <xsd:element ref="dcterms:modified" minOccurs="0" maxOccurs="1"/>
+        <xsd:element name="contentStatus" minOccurs="0" maxOccurs="1" type="xsd:string"/>
+      </xsd:all>
+    </xsd:complexType>
+  </xsd:schema>
+  <xs:schema xmlns:pc="http://schemas.microsoft.com/office/infopath/2007/PartnerControls" xmlns:xs="http://www.w3.org/2001/XMLSchema" targetNamespace="http://schemas.microsoft.com/office/infopath/2007/PartnerControls" elementFormDefault="qualified" attributeFormDefault="unqualified">
+    <xs:element name="Person">
+      <xs:complexType>
+        <xs:sequence>
+          <xs:element ref="pc:DisplayName" minOccurs="0"/>
+          <xs:element ref="pc:AccountId" minOccurs="0"/>
+          <xs:element ref="pc:AccountType" minOccurs="0"/>
+        </xs:sequence>
+      </xs:complexType>
+    </xs:element>
+    <xs:element name="DisplayName" type="xs:string"/>
+    <xs:element name="AccountId" type="xs:string"/>
+    <xs:element name="AccountType" type="xs:string"/>
+    <xs:element name="BDCAssociatedEntity">
+      <xs:complexType>
+        <xs:sequence>
+          <xs:element ref="pc:BDCEntity" minOccurs="0" maxOccurs="unbounded"/>
+        </xs:sequence>
+        <xs:attribute ref="pc:EntityNamespace"/>
+        <xs:attribute ref="pc:EntityName"/>
+        <xs:attribute ref="pc:SystemInstanceName"/>
+        <xs:attribute ref="pc:AssociationName"/>
+      </xs:complexType>
+    </xs:element>
+    <xs:attribute name="EntityNamespace" type="xs:string"/>
+    <xs:attribute name="EntityName" type="xs:string"/>
+    <xs:attribute name="SystemInstanceName" type="xs:string"/>
+    <xs:attribute name="AssociationName" type="xs:string"/>
+    <xs:element name="BDCEntity">
+      <xs:complexType>
+        <xs:sequence>
+          <xs:element ref="pc:EntityDisplayName" minOccurs="0"/>
+          <xs:element ref="pc:EntityInstanceReference" minOccurs="0"/>
+          <xs:element ref="pc:EntityId1" minOccurs="0"/>
+          <xs:element ref="pc:EntityId2" minOccurs="0"/>
+          <xs:element ref="pc:EntityId3" minOccurs="0"/>
+          <xs:element ref="pc:EntityId4" minOccurs="0"/>
+          <xs:element ref="pc:EntityId5" minOccurs="0"/>
+        </xs:sequence>
+      </xs:complexType>
+    </xs:element>
+    <xs:element name="EntityDisplayName" type="xs:string"/>
+    <xs:element name="EntityInstanceReference" type="xs:string"/>
+    <xs:element name="EntityId1" type="xs:string"/>
+    <xs:element name="EntityId2" type="xs:string"/>
+    <xs:element name="EntityId3" type="xs:string"/>
+    <xs:element name="EntityId4" type="xs:string"/>
+    <xs:element name="EntityId5" type="xs:string"/>
+    <xs:element name="Terms">
+      <xs:complexType>
+        <xs:sequence>
+          <xs:element ref="pc:TermInfo" minOccurs="0" maxOccurs="unbounded"/>
+        </xs:sequence>
+      </xs:complexType>
+    </xs:element>
+    <xs:element name="TermInfo">
+      <xs:complexType>
+        <xs:sequence>
+          <xs:element ref="pc:TermName" minOccurs="0"/>
+          <xs:element ref="pc:TermId" minOccurs="0"/>
+        </xs:sequence>
+      </xs:complexType>
+    </xs:element>
+    <xs:element name="TermName" type="xs:string"/>
+    <xs:element name="TermId" type="xs:string"/>
+  </xs:schema>
+</ct:contentTypeSchema>
+</file>
+
+<file path=customXml/itemProps1.xml><?xml version="1.0" encoding="utf-8"?>
+<ds:datastoreItem xmlns:ds="http://schemas.openxmlformats.org/officeDocument/2006/customXml" ds:itemID="{DFBB9260-490A-4BA0-BCD3-FFFFB2570CFB}">
+  <ds:schemaRefs>
+    <ds:schemaRef ds:uri="http://schemas.microsoft.com/office/2006/metadata/properties"/>
+    <ds:schemaRef ds:uri="http://schemas.microsoft.com/office/infopath/2007/PartnerControls"/>
+    <ds:schemaRef ds:uri="01d5e555-494a-40ad-b5bc-1378a5d8ad0d"/>
+  </ds:schemaRefs>
+</ds:datastoreItem>
+</file>
+
+<file path=customXml/itemProps2.xml><?xml version="1.0" encoding="utf-8"?>
+<ds:datastoreItem xmlns:ds="http://schemas.openxmlformats.org/officeDocument/2006/customXml" ds:itemID="{E2A67710-3684-40EA-A8C7-76C2840EAA7F}">
+  <ds:schemaRefs>
+    <ds:schemaRef ds:uri="http://schemas.microsoft.com/sharepoint/v3/contenttype/forms"/>
+  </ds:schemaRefs>
+</ds:datastoreItem>
+</file>
+
+<file path=customXml/itemProps3.xml><?xml version="1.0" encoding="utf-8"?>
+<ds:datastoreItem xmlns:ds="http://schemas.openxmlformats.org/officeDocument/2006/customXml" ds:itemID="{6D9C1593-FF92-49B2-BB0E-42561C936097}">
+  <ds:schemaRefs>
+    <ds:schemaRef ds:uri="http://schemas.microsoft.com/office/2006/metadata/contentType"/>
+    <ds:schemaRef ds:uri="http://schemas.microsoft.com/office/2006/metadata/properties/metaAttributes"/>
+    <ds:schemaRef ds:uri="http://www.w3.org/2001/XMLSchema"/>
+    <ds:schemaRef ds:uri="http://schemas.microsoft.com/office/2006/metadata/properties"/>
+    <ds:schemaRef ds:uri="01d5e555-494a-40ad-b5bc-1378a5d8ad0d"/>
+    <ds:schemaRef ds:uri="http://schemas.microsoft.com/office/2006/documentManagement/types"/>
+    <ds:schemaRef ds:uri="http://schemas.microsoft.com/office/infopath/2007/PartnerControls"/>
+    <ds:schemaRef ds:uri="http://schemas.openxmlformats.org/package/2006/metadata/core-properties"/>
+    <ds:schemaRef ds:uri="http://purl.org/dc/elements/1.1/"/>
+    <ds:schemaRef ds:uri="http://purl.org/dc/terms/"/>
+    <ds:schemaRef ds:uri="http://schemas.microsoft.com/internal/obd"/>
+  </ds:schemaRefs>
+</ds:datastoreItem>
+</file>
+
 <file path=docMetadata/LabelInfo.xml><?xml version="1.0" encoding="utf-8"?>
 <clbl:labelList xmlns:clbl="http://schemas.microsoft.com/office/2020/mipLabelMetadata">
   <clbl:label id="{ddaa77bc-0157-46a4-82a6-8fc765694bc9}" enabled="1" method="Standard" siteId="{d1323671-cdbe-4417-b4d4-bdb24b51316b}" contentBits="0" removed="0"/>

</xml_diff>